<commit_message>
Agregadas actas actualizadas de los indonesios y planos del buque
</commit_message>
<xml_diff>
--- a/files/ACTA DE INFORMACION SUMARIA - Marinero Indonesio MURDIONO.docx
+++ b/files/ACTA DE INFORMACION SUMARIA - Marinero Indonesio MURDIONO.docx
@@ -13,6 +13,12 @@
           <w:szCs w:val="24"/>
         </w:rPr>
       </w:pPr>
+      <w:r>
+        <w:rPr>
+          <w:sz w:val="24"/>
+          <w:szCs w:val="24"/>
+        </w:rPr>
+      </w:r>
       <w:r>
         <w:rPr>
           <w:sz w:val="24"/>
@@ -25,42 +31,21 @@
           <w:sz w:val="24"/>
           <w:szCs w:val="24"/>
         </w:rPr>
-        <w:t xml:space="preserve">31</w:t>
+        <w:t xml:space="preserve">03</w:t>
       </w:r>
       <w:r>
         <w:rPr>
           <w:sz w:val="24"/>
           <w:szCs w:val="24"/>
         </w:rPr>
-        <w:t xml:space="preserve"> de agosto de 2026 a la hora 1</w:t>
+        <w:t xml:space="preserve"> de septiembre de 2026 a la hora 11:00</w:t>
       </w:r>
       <w:r>
         <w:rPr>
           <w:sz w:val="24"/>
           <w:szCs w:val="24"/>
         </w:rPr>
-        <w:t xml:space="preserve">6</w:t>
-      </w:r>
-      <w:r>
-        <w:rPr>
-          <w:sz w:val="24"/>
-          <w:szCs w:val="24"/>
-        </w:rPr>
-        <w:t xml:space="preserve">:</w:t>
-      </w:r>
-      <w:r>
-        <w:rPr>
-          <w:sz w:val="24"/>
-          <w:szCs w:val="24"/>
-        </w:rPr>
-        <w:t xml:space="preserve">3</w:t>
-      </w:r>
-      <w:r>
-        <w:rPr>
-          <w:sz w:val="24"/>
-          <w:szCs w:val="24"/>
-        </w:rPr>
-        <w:t xml:space="preserve">0 comparece ante </w:t>
+        <w:t xml:space="preserve"> comparece ante </w:t>
       </w:r>
       <w:r>
         <w:rPr>
@@ -76,40 +61,41 @@
         </w:rPr>
         <w:t xml:space="preserve">, </w:t>
       </w:r>
+      <w:r/>
       <w:r>
         <w:rPr>
           <w:sz w:val="24"/>
           <w:szCs w:val="24"/>
         </w:rPr>
-        <w:t xml:space="preserve">Alférez</w:t>
       </w:r>
       <w:r>
         <w:rPr>
           <w:sz w:val="24"/>
           <w:szCs w:val="24"/>
         </w:rPr>
-        <w:t xml:space="preserve"> de Navío (CP) </w:t>
       </w:r>
       <w:r>
         <w:rPr>
           <w:sz w:val="24"/>
           <w:szCs w:val="24"/>
+          <w:highlight w:val="none"/>
         </w:rPr>
-        <w:t xml:space="preserve">Brian</w:t>
+        <w:t xml:space="preserve">Teniente </w:t>
       </w:r>
       <w:r>
         <w:rPr>
           <w:sz w:val="24"/>
           <w:szCs w:val="24"/>
+          <w:highlight w:val="none"/>
         </w:rPr>
-        <w:t xml:space="preserve"> </w:t>
+        <w:t xml:space="preserve">de Navío (CP) Joaquín PEREZ CORIA</w:t>
       </w:r>
+      <w:r/>
       <w:r>
         <w:rPr>
           <w:sz w:val="24"/>
           <w:szCs w:val="24"/>
         </w:rPr>
-        <w:t xml:space="preserve">MUÑIZ</w:t>
       </w:r>
       <w:r>
         <w:rPr>
@@ -138,6 +124,12 @@
           <w:szCs w:val="24"/>
         </w:rPr>
         <w:t xml:space="preserve">, que es interrogada en el siguiente tenor, referente al sumario del buque “Alpha Crux”, bandera rusa, Nro. OMI 9024621, referente a lo sucedido el día 25 de agosto de 2026.</w:t>
+      </w:r>
+      <w:r>
+        <w:rPr>
+          <w:sz w:val="24"/>
+          <w:szCs w:val="24"/>
+        </w:rPr>
       </w:r>
       <w:r>
         <w:rPr>
@@ -369,6 +361,14 @@
           <w:szCs w:val="24"/>
         </w:rPr>
       </w:r>
+      <w:r>
+        <w:rPr>
+          <w:b/>
+          <w:bCs/>
+          <w:sz w:val="24"/>
+          <w:szCs w:val="24"/>
+        </w:rPr>
+      </w:r>
     </w:p>
     <w:p>
       <w:pPr>
@@ -474,6 +474,12 @@
           <w:szCs w:val="24"/>
         </w:rPr>
       </w:r>
+      <w:r>
+        <w:rPr>
+          <w:sz w:val="24"/>
+          <w:szCs w:val="24"/>
+        </w:rPr>
+      </w:r>
     </w:p>
     <w:p>
       <w:pPr>
@@ -496,6 +502,14 @@
           <w:szCs w:val="24"/>
         </w:rPr>
         <w:t xml:space="preserve">2 – PARA QUE DIGA SI SABE PORQUE ESTA SIENDO INTERROGADO. -</w:t>
+      </w:r>
+      <w:r>
+        <w:rPr>
+          <w:b/>
+          <w:bCs/>
+          <w:sz w:val="24"/>
+          <w:szCs w:val="24"/>
+        </w:rPr>
       </w:r>
       <w:r>
         <w:rPr>
@@ -554,6 +568,12 @@
           <w:szCs w:val="24"/>
         </w:rPr>
       </w:r>
+      <w:r>
+        <w:rPr>
+          <w:sz w:val="24"/>
+          <w:szCs w:val="24"/>
+        </w:rPr>
+      </w:r>
     </w:p>
     <w:p>
       <w:pPr>
@@ -603,6 +623,14 @@
           <w:szCs w:val="24"/>
         </w:rPr>
         <w:t xml:space="preserve">. -</w:t>
+      </w:r>
+      <w:r>
+        <w:rPr>
+          <w:b/>
+          <w:bCs/>
+          <w:sz w:val="24"/>
+          <w:szCs w:val="24"/>
+        </w:rPr>
       </w:r>
       <w:r>
         <w:rPr>
@@ -700,6 +728,14 @@
           <w:szCs w:val="24"/>
         </w:rPr>
       </w:r>
+      <w:r>
+        <w:rPr>
+          <w:b/>
+          <w:bCs/>
+          <w:sz w:val="24"/>
+          <w:szCs w:val="24"/>
+        </w:rPr>
+      </w:r>
     </w:p>
     <w:p>
       <w:pPr>
@@ -767,6 +803,14 @@
           <w:szCs w:val="24"/>
         </w:rPr>
         <w:t xml:space="preserve">. -</w:t>
+      </w:r>
+      <w:r>
+        <w:rPr>
+          <w:b/>
+          <w:bCs/>
+          <w:sz w:val="24"/>
+          <w:szCs w:val="24"/>
+        </w:rPr>
       </w:r>
       <w:r>
         <w:rPr>
@@ -860,6 +904,12 @@
           <w:szCs w:val="24"/>
         </w:rPr>
       </w:r>
+      <w:r>
+        <w:rPr>
+          <w:sz w:val="24"/>
+          <w:szCs w:val="24"/>
+        </w:rPr>
+      </w:r>
     </w:p>
     <w:p>
       <w:pPr>
@@ -927,6 +977,14 @@
           <w:szCs w:val="24"/>
         </w:rPr>
       </w:r>
+      <w:r>
+        <w:rPr>
+          <w:b/>
+          <w:bCs/>
+          <w:sz w:val="24"/>
+          <w:szCs w:val="24"/>
+        </w:rPr>
+      </w:r>
     </w:p>
     <w:p>
       <w:pPr>
@@ -975,7 +1033,7 @@
           <w:sz w:val="24"/>
           <w:szCs w:val="24"/>
         </w:rPr>
-        <w:t xml:space="preserve">pero fueron a reparar el sistema de refrigeración del buque, nada relacionado con la sala de máquinas</w:t>
+        <w:t xml:space="preserve">pero fueron a reparar el sistema de refrigeración de la bodega, nada relacionado con la sala de máquinas</w:t>
       </w:r>
       <w:r>
         <w:rPr>
@@ -983,6 +1041,12 @@
           <w:szCs w:val="24"/>
         </w:rPr>
         <w:t xml:space="preserve">. -</w:t>
+      </w:r>
+      <w:r>
+        <w:rPr>
+          <w:sz w:val="24"/>
+          <w:szCs w:val="24"/>
+        </w:rPr>
       </w:r>
       <w:r>
         <w:rPr>
@@ -1057,6 +1121,14 @@
           <w:szCs w:val="24"/>
         </w:rPr>
       </w:r>
+      <w:r>
+        <w:rPr>
+          <w:b/>
+          <w:bCs/>
+          <w:sz w:val="24"/>
+          <w:szCs w:val="24"/>
+        </w:rPr>
+      </w:r>
     </w:p>
     <w:p>
       <w:pPr>
@@ -1120,6 +1192,12 @@
           <w:szCs w:val="24"/>
         </w:rPr>
       </w:r>
+      <w:r>
+        <w:rPr>
+          <w:sz w:val="24"/>
+          <w:szCs w:val="24"/>
+        </w:rPr>
+      </w:r>
     </w:p>
     <w:p>
       <w:pPr>
@@ -1306,7 +1384,7 @@
           <w:sz w:val="24"/>
           <w:szCs w:val="24"/>
         </w:rPr>
-        <w:t xml:space="preserve">. El día del incidente no había perdida de ese tubo. </w:t>
+        <w:t xml:space="preserve">. El día del incidente no había perdida de ese tubo. El día del incidente se encontraban buscando la filtración en la bodega X, X, y X con un coreano que vino de tierra. </w:t>
       </w:r>
       <w:r>
         <w:rPr>
@@ -1317,40 +1395,6 @@
       </w:r>
       <w:r>
         <w:rPr>
-          <w:sz w:val="24"/>
-          <w:szCs w:val="24"/>
-          <w:highlight w:val="none"/>
-        </w:rPr>
-      </w:r>
-      <w:r>
-        <w:rPr>
-          <w:sz w:val="24"/>
-          <w:szCs w:val="24"/>
-          <w:highlight w:val="none"/>
-        </w:rPr>
-      </w:r>
-      <w:r>
-        <w:rPr>
-          <w:b/>
-          <w:bCs/>
-          <w:sz w:val="24"/>
-          <w:szCs w:val="24"/>
-          <w:highlight w:val="none"/>
-        </w:rPr>
-      </w:r>
-      <w:r>
-        <w:rPr>
-          <w:b/>
-          <w:bCs/>
-          <w:sz w:val="24"/>
-          <w:szCs w:val="24"/>
-          <w:highlight w:val="none"/>
-        </w:rPr>
-      </w:r>
-      <w:r>
-        <w:rPr>
-          <w:b/>
-          <w:bCs/>
           <w:sz w:val="24"/>
           <w:szCs w:val="24"/>
           <w:highlight w:val="none"/>
@@ -1466,7 +1510,14 @@
           <w:sz w:val="24"/>
           <w:szCs w:val="24"/>
         </w:rPr>
-        <w:t xml:space="preserve">nes del jefe de maquinas coreano, Park Kwang Jun. La jornada de trabajo es de 12 horas continuas y 6 de descanso, posterior a las 6 de descanso comienzan nuevamente las 12 horas de trabajo, en tres turnos diferentes. En puerto es de las 08:00 hasta las 15:00</w:t>
+        <w:t xml:space="preserve">ne</w:t>
+      </w:r>
+      <w:r>
+        <w:rPr>
+          <w:sz w:val="24"/>
+          <w:szCs w:val="24"/>
+        </w:rPr>
+        <w:t xml:space="preserve">s del jefe de maquinas coreano, Park Kwang Jun. La jornada de trabajo es de 12 horas continuas y 6 de descanso, posterior a las 6 de descanso comienzan nuevamente las 12 horas de trabajo, en tres turnos diferentes. En puerto es de las 08:00 hasta las 15:00</w:t>
       </w:r>
       <w:r>
         <w:rPr>
@@ -1588,19 +1639,6 @@
         <w:rPr>
           <w:sz w:val="24"/>
           <w:szCs w:val="24"/>
-        </w:rPr>
-      </w:r>
-      <w:r>
-        <w:rPr>
-          <w:sz w:val="24"/>
-          <w:szCs w:val="24"/>
-          <w:highlight w:val="none"/>
-        </w:rPr>
-      </w:r>
-      <w:r>
-        <w:rPr>
-          <w:sz w:val="24"/>
-          <w:szCs w:val="24"/>
           <w:highlight w:val="none"/>
         </w:rPr>
       </w:r>
@@ -1668,6 +1706,7 @@
           <w:bCs/>
           <w:sz w:val="24"/>
           <w:szCs w:val="24"/>
+          <w:highlight w:val="none"/>
         </w:rPr>
       </w:pPr>
       <w:r>
@@ -1722,6 +1761,218 @@
           <w:bCs/>
           <w:sz w:val="24"/>
           <w:szCs w:val="24"/>
+          <w:highlight w:val="none"/>
+        </w:rPr>
+      </w:pPr>
+      <w:r>
+        <w:rPr>
+          <w:b/>
+          <w:bCs/>
+          <w:sz w:val="24"/>
+          <w:szCs w:val="24"/>
+        </w:rPr>
+        <w:t xml:space="preserve">12</w:t>
+      </w:r>
+      <w:r>
+        <w:rPr>
+          <w:b/>
+          <w:bCs/>
+          <w:sz w:val="24"/>
+          <w:szCs w:val="24"/>
+        </w:rPr>
+        <w:t xml:space="preserve"> – PARA QUE DIGA SI ESTUVO TRABAJANDO CON EL JEFE DE MAQUINAS COREANO PARK KWANG JUN EN EL CAMBIO DE TRES TRAMOS DE CA</w:t>
+      </w:r>
+      <w:r>
+        <w:rPr>
+          <w:b/>
+          <w:bCs/>
+          <w:sz w:val="24"/>
+          <w:szCs w:val="24"/>
+        </w:rPr>
+        <w:t xml:space="preserve">Ñ</w:t>
+      </w:r>
+      <w:r>
+        <w:rPr>
+          <w:b/>
+          <w:bCs/>
+          <w:sz w:val="24"/>
+          <w:szCs w:val="24"/>
+        </w:rPr>
+        <w:t xml:space="preserve">O DE REFRIGERACON DEL MOTOR PRINCIPAL EL DIA 22 DE AGOSTO</w:t>
+      </w:r>
+      <w:r>
+        <w:rPr>
+          <w:b/>
+          <w:bCs/>
+          <w:sz w:val="24"/>
+          <w:szCs w:val="24"/>
+        </w:rPr>
+        <w:t xml:space="preserve">. -</w:t>
+      </w:r>
+      <w:r/>
+      <w:r>
+        <w:rPr>
+          <w:b/>
+          <w:bCs/>
+          <w:sz w:val="24"/>
+          <w:szCs w:val="24"/>
+          <w:highlight w:val="none"/>
+        </w:rPr>
+      </w:r>
+    </w:p>
+    <w:p>
+      <w:pPr>
+        <w:pBdr/>
+        <w:spacing w:after="113" w:before="113"/>
+        <w:ind/>
+        <w:jc w:val="both"/>
+        <w:rPr>
+          <w:sz w:val="24"/>
+          <w:szCs w:val="24"/>
+        </w:rPr>
+      </w:pPr>
+      <w:r>
+        <w:rPr>
+          <w:b/>
+          <w:bCs/>
+          <w:sz w:val="24"/>
+          <w:szCs w:val="24"/>
+          <w:u w:val="single"/>
+        </w:rPr>
+        <w:t xml:space="preserve">CONTESTA:</w:t>
+      </w:r>
+      <w:r>
+        <w:rPr>
+          <w:sz w:val="24"/>
+          <w:szCs w:val="24"/>
+        </w:rPr>
+        <w:t xml:space="preserve"> Si, nosotros cambiamos un c</w:t>
+      </w:r>
+      <w:r>
+        <w:rPr>
+          <w:sz w:val="24"/>
+          <w:szCs w:val="24"/>
+        </w:rPr>
+        <w:t xml:space="preserve">a</w:t>
+      </w:r>
+      <w:r>
+        <w:rPr>
+          <w:sz w:val="24"/>
+          <w:szCs w:val="24"/>
+        </w:rPr>
+        <w:t xml:space="preserve">ñ</w:t>
+      </w:r>
+      <w:r>
+        <w:rPr>
+          <w:sz w:val="24"/>
+          <w:szCs w:val="24"/>
+        </w:rPr>
+        <w:t xml:space="preserve">o en sala de maquinas con el jefe de maquinas coreano. El ca</w:t>
+      </w:r>
+      <w:r>
+        <w:rPr>
+          <w:sz w:val="24"/>
+          <w:szCs w:val="24"/>
+        </w:rPr>
+        <w:t xml:space="preserve">ñ</w:t>
+      </w:r>
+      <w:r>
+        <w:rPr>
+          <w:sz w:val="24"/>
+          <w:szCs w:val="24"/>
+        </w:rPr>
+        <w:t xml:space="preserve">o era de agua y para el motor principal. Se hicieron pruebas posteriores al cambio y se confirmo que la reparación qued</w:t>
+      </w:r>
+      <w:r>
+        <w:rPr>
+          <w:sz w:val="24"/>
+          <w:szCs w:val="24"/>
+        </w:rPr>
+        <w:t xml:space="preserve">ó</w:t>
+      </w:r>
+      <w:r/>
+      <w:r>
+        <w:rPr>
+          <w:sz w:val="24"/>
+          <w:szCs w:val="24"/>
+        </w:rPr>
+        <w:t xml:space="preserve"> bien hecho sin perdidas. El ca</w:t>
+      </w:r>
+      <w:r>
+        <w:rPr>
+          <w:sz w:val="24"/>
+          <w:szCs w:val="24"/>
+        </w:rPr>
+      </w:r>
+      <w:r>
+        <w:rPr>
+          <w:sz w:val="24"/>
+          <w:szCs w:val="24"/>
+        </w:rPr>
+        <w:t xml:space="preserve">ñ</w:t>
+      </w:r>
+      <w:r>
+        <w:rPr>
+          <w:sz w:val="24"/>
+          <w:szCs w:val="24"/>
+        </w:rPr>
+        <w:t xml:space="preserve">o lo trajeron de tierra, el mismo coreano que estaba buscando la perdida en la bodega de pescado. Asimismo, este coreano no tenia nada que ver con la empresa uruguaya que trabajo en la refrigeración de la bodega. El cambio lo hicimos en la ma</w:t>
+      </w:r>
+      <w:r>
+        <w:rPr>
+          <w:sz w:val="24"/>
+          <w:szCs w:val="24"/>
+        </w:rPr>
+        <w:t xml:space="preserve">ñ</w:t>
+      </w:r>
+      <w:r>
+        <w:rPr>
+          <w:sz w:val="24"/>
+          <w:szCs w:val="24"/>
+        </w:rPr>
+        <w:t xml:space="preserve">ana del día antes del incidente</w:t>
+      </w:r>
+      <w:r>
+        <w:rPr>
+          <w:sz w:val="24"/>
+          <w:szCs w:val="24"/>
+        </w:rPr>
+        <w:t xml:space="preserve">. Este coreano esta hoy trabajando en el Sur Este 707 y en el Sur Este 701. </w:t>
+      </w:r>
+      <w:r>
+        <w:rPr>
+          <w:sz w:val="24"/>
+          <w:szCs w:val="24"/>
+        </w:rPr>
+        <w:t xml:space="preserve">-</w:t>
+      </w:r>
+      <w:r>
+        <w:rPr>
+          <w:b/>
+          <w:bCs/>
+          <w:sz w:val="24"/>
+          <w:szCs w:val="24"/>
+          <w:highlight w:val="none"/>
+        </w:rPr>
+      </w:r>
+      <w:r>
+        <w:rPr>
+          <w:sz w:val="24"/>
+          <w:szCs w:val="24"/>
+        </w:rPr>
+      </w:r>
+    </w:p>
+    <w:p>
+      <w:pPr>
+        <w:pBdr/>
+        <w:spacing w:after="113" w:before="113"/>
+        <w:ind/>
+        <w:jc w:val="both"/>
+        <w:rPr>
+          <w:b/>
+          <w:bCs/>
+          <w:sz w:val="24"/>
+          <w:szCs w:val="24"/>
         </w:rPr>
       </w:pPr>
       <w:r>
@@ -1737,7 +1988,7 @@
           <w:sz w:val="24"/>
           <w:szCs w:val="24"/>
         </w:rPr>
-        <w:t xml:space="preserve">12 – PARA QUE DIGA SI HAY ALGUN HECHO RELACIONADO CON EL INCIDENTE QUE NO HAYA SIDO PREGUNTADO Y QUE CONSIDERE IMPORTANTE ACLARAR. -</w:t>
+        <w:t xml:space="preserve">13 – PARA QUE DIGA SI HAY ALGUN HECHO RELACIONADO CON EL INCIDENTE QUE NO HAYA SIDO PREGUNTADO Y QUE CONSIDERE IMPORTANTE ACLARAR. -</w:t>
       </w:r>
       <w:r>
         <w:rPr>
@@ -1844,52 +2095,14 @@
           <w:sz w:val="24"/>
           <w:szCs w:val="24"/>
         </w:rPr>
-        <w:t xml:space="preserve">EN LA PREFECTURA DEL PUERTO DE MONTEVIDEO, </w:t>
+        <w:t xml:space="preserve">EN LA PREFECTURA DEL PUERTO DE MONTEVIDEO, 03</w:t>
       </w:r>
       <w:r>
         <w:rPr>
           <w:sz w:val="24"/>
           <w:szCs w:val="24"/>
         </w:rPr>
-        <w:t xml:space="preserve">31</w:t>
-      </w:r>
-      <w:r>
-        <w:rPr>
-          <w:sz w:val="24"/>
-          <w:szCs w:val="24"/>
-        </w:rPr>
-        <w:t xml:space="preserve"> DE AGOSTO DE 2026 A LAS </w:t>
-      </w:r>
-      <w:r>
-        <w:rPr>
-          <w:sz w:val="24"/>
-          <w:szCs w:val="24"/>
-        </w:rPr>
-        <w:t xml:space="preserve">17</w:t>
-      </w:r>
-      <w:r>
-        <w:rPr>
-          <w:color w:val="000000"/>
-          <w:sz w:val="24"/>
-          <w:szCs w:val="24"/>
-        </w:rPr>
-        <w:t xml:space="preserve">:</w:t>
-      </w:r>
-      <w:r>
-        <w:rPr>
-          <w:color w:val="000000"/>
-          <w:sz w:val="24"/>
-          <w:szCs w:val="24"/>
-        </w:rPr>
-        <w:t xml:space="preserve">0</w:t>
-      </w:r>
-      <w:r>
-        <w:rPr>
-          <w:color w:val="000000"/>
-          <w:sz w:val="24"/>
-          <w:szCs w:val="24"/>
-        </w:rPr>
-        <w:t xml:space="preserve">0</w:t>
+        <w:t xml:space="preserve"> DE SEPTIEMBRE DE 2026 A LAS 11:30</w:t>
       </w:r>
       <w:r>
         <w:rPr>
@@ -1904,17 +2117,18 @@
           <w:szCs w:val="24"/>
         </w:rPr>
       </w:r>
-    </w:p>
-    <w:p>
-      <w:pPr>
-        <w:pBdr/>
-        <w:spacing/>
-        <w:ind/>
+      <w:r>
         <w:rPr>
           <w:sz w:val="24"/>
           <w:szCs w:val="24"/>
         </w:rPr>
-      </w:pPr>
+      </w:r>
+      <w:r>
+        <w:rPr>
+          <w:sz w:val="24"/>
+          <w:szCs w:val="24"/>
+        </w:rPr>
+      </w:r>
       <w:r>
         <w:rPr>
           <w:sz w:val="24"/>
@@ -1943,25 +2157,7 @@
           <w:sz w:val="24"/>
           <w:szCs w:val="24"/>
         </w:rPr>
-        <w:t xml:space="preserve">Deponente:  </w:t>
       </w:r>
-      <w:r>
-        <w:rPr>
-          <w:sz w:val="24"/>
-          <w:szCs w:val="24"/>
-        </w:rPr>
-      </w:r>
-    </w:p>
-    <w:p>
-      <w:pPr>
-        <w:pBdr/>
-        <w:spacing/>
-        <w:ind/>
-        <w:rPr>
-          <w:sz w:val="24"/>
-          <w:szCs w:val="24"/>
-        </w:rPr>
-      </w:pPr>
       <w:r>
         <w:rPr>
           <w:sz w:val="24"/>
@@ -1990,6 +2186,13 @@
           <w:sz w:val="24"/>
           <w:szCs w:val="24"/>
         </w:rPr>
+        <w:t xml:space="preserve">Deponente:  </w:t>
+      </w:r>
+      <w:r>
+        <w:rPr>
+          <w:sz w:val="24"/>
+          <w:szCs w:val="24"/>
+        </w:rPr>
       </w:r>
       <w:r>
         <w:rPr>
@@ -2008,6 +2211,12 @@
           <w:szCs w:val="24"/>
         </w:rPr>
       </w:pPr>
+      <w:r>
+        <w:rPr>
+          <w:sz w:val="24"/>
+          <w:szCs w:val="24"/>
+        </w:rPr>
+      </w:r>
       <w:r>
         <w:rPr>
           <w:sz w:val="24"/>
@@ -2072,17 +2281,29 @@
           <w:szCs w:val="24"/>
         </w:rPr>
       </w:r>
-    </w:p>
-    <w:p>
-      <w:pPr>
-        <w:pBdr/>
-        <w:spacing/>
-        <w:ind/>
+      <w:r>
         <w:rPr>
           <w:sz w:val="24"/>
           <w:szCs w:val="24"/>
         </w:rPr>
-      </w:pPr>
+      </w:r>
+    </w:p>
+    <w:p>
+      <w:pPr>
+        <w:pBdr/>
+        <w:spacing/>
+        <w:ind/>
+        <w:rPr>
+          <w:sz w:val="24"/>
+          <w:szCs w:val="24"/>
+        </w:rPr>
+      </w:pPr>
+      <w:r>
+        <w:rPr>
+          <w:sz w:val="24"/>
+          <w:szCs w:val="24"/>
+        </w:rPr>
+      </w:r>
       <w:r>
         <w:rPr>
           <w:sz w:val="24"/>
@@ -2119,18 +2340,88 @@
           <w:szCs w:val="24"/>
         </w:rPr>
       </w:r>
+      <w:r>
+        <w:rPr>
+          <w:sz w:val="24"/>
+          <w:szCs w:val="24"/>
+        </w:rPr>
+      </w:r>
     </w:p>
     <w:p>
       <w:pPr>
-        <w:pBdr/>
-        <w:spacing/>
-        <w:ind/>
+        <w:pStyle w:val="720"/>
+        <w:pBdr/>
+        <w:spacing w:line="240" w:lineRule="auto"/>
+        <w:ind w:left="0"/>
+        <w:jc w:val="both"/>
+        <w:rPr>
+          <w:sz w:val="24"/>
+          <w:szCs w:val="24"/>
+          <w:highlight w:val="none"/>
+        </w:rPr>
+      </w:pPr>
+      <w:r>
+        <w:rPr>
+          <w:sz w:val="24"/>
+          <w:szCs w:val="24"/>
+        </w:rPr>
+        <w:t xml:space="preserve">Oficial Actuante: </w:t>
+        <w:tab/>
+        <w:t xml:space="preserve">TN (CP)</w:t>
+      </w:r>
+      <w:r>
+        <w:rPr>
+          <w:sz w:val="24"/>
+          <w:szCs w:val="24"/>
+          <w:highlight w:val="none"/>
+        </w:rPr>
+      </w:r>
+      <w:r>
+        <w:rPr>
+          <w:sz w:val="24"/>
+          <w:szCs w:val="24"/>
+          <w:highlight w:val="none"/>
+        </w:rPr>
+      </w:r>
+    </w:p>
+    <w:p>
+      <w:pPr>
+        <w:pStyle w:val="720"/>
+        <w:pBdr/>
+        <w:spacing w:line="240" w:lineRule="auto"/>
+        <w:ind w:left="0"/>
         <w:jc w:val="both"/>
         <w:rPr>
           <w:sz w:val="24"/>
           <w:szCs w:val="24"/>
         </w:rPr>
       </w:pPr>
+      <w:r>
+        <w:rPr>
+          <w:sz w:val="24"/>
+          <w:szCs w:val="24"/>
+        </w:rPr>
+        <w:tab/>
+        <w:tab/>
+        <w:tab/>
+        <w:tab/>
+        <w:tab/>
+        <w:t xml:space="preserve">  Joaquín </w:t>
+      </w:r>
+      <w:r>
+        <w:rPr>
+          <w:sz w:val="24"/>
+          <w:szCs w:val="24"/>
+        </w:rPr>
+        <w:t xml:space="preserve">PÉREZ</w:t>
+      </w:r>
+      <w:r>
+        <w:rPr>
+          <w:sz w:val="24"/>
+          <w:szCs w:val="24"/>
+        </w:rPr>
+        <w:t xml:space="preserve"> CORIA</w:t>
+      </w:r>
       <w:r>
         <w:rPr>
           <w:sz w:val="24"/>
@@ -2146,15 +2437,27 @@
     </w:p>
     <w:p>
       <w:pPr>
-        <w:pBdr/>
-        <w:spacing/>
-        <w:ind/>
+        <w:pStyle w:val="720"/>
+        <w:pBdr/>
+        <w:spacing w:line="240" w:lineRule="auto"/>
+        <w:ind w:left="0"/>
         <w:jc w:val="both"/>
         <w:rPr>
           <w:sz w:val="24"/>
           <w:szCs w:val="24"/>
         </w:rPr>
       </w:pPr>
+      <w:r>
+        <w:rPr>
+          <w:sz w:val="24"/>
+          <w:szCs w:val="24"/>
+        </w:rPr>
+        <w:tab/>
+        <w:tab/>
+        <w:tab/>
+        <w:tab/>
+        <w:t xml:space="preserve">     Jefe de Depto. Despacho de Buques </w:t>
+      </w:r>
       <w:r>
         <w:rPr>
           <w:sz w:val="24"/>
@@ -2170,42 +2473,41 @@
     </w:p>
     <w:p>
       <w:pPr>
-        <w:pBdr/>
-        <w:spacing/>
-        <w:ind/>
+        <w:pStyle w:val="720"/>
+        <w:pBdr/>
+        <w:spacing w:line="240" w:lineRule="auto"/>
+        <w:ind w:left="0"/>
         <w:jc w:val="both"/>
         <w:rPr>
           <w:sz w:val="24"/>
           <w:szCs w:val="24"/>
+          <w:highlight w:val="none"/>
         </w:rPr>
       </w:pPr>
-      <w:r>
-        <w:rPr>
-          <w:sz w:val="24"/>
-          <w:szCs w:val="24"/>
-        </w:rPr>
-        <w:t xml:space="preserve">Oficial Actuante: </w:t>
-      </w:r>
       <w:r>
         <w:rPr>
           <w:sz w:val="24"/>
           <w:szCs w:val="24"/>
         </w:rPr>
         <w:tab/>
+        <w:tab/>
+        <w:tab/>
+        <w:tab/>
+        <w:t xml:space="preserve">     Prefectura del Puerto de Montevideo</w:t>
       </w:r>
       <w:r>
         <w:rPr>
           <w:sz w:val="24"/>
           <w:szCs w:val="24"/>
+          <w:highlight w:val="none"/>
         </w:rPr>
-        <w:t xml:space="preserve">A</w:t>
       </w:r>
       <w:r>
         <w:rPr>
           <w:sz w:val="24"/>
           <w:szCs w:val="24"/>
+          <w:highlight w:val="none"/>
         </w:rPr>
-        <w:t xml:space="preserve">N (CP)</w:t>
       </w:r>
       <w:r>
         <w:rPr>
@@ -2213,88 +2515,19 @@
           <w:szCs w:val="24"/>
         </w:rPr>
       </w:r>
-    </w:p>
-    <w:p>
-      <w:pPr>
-        <w:pBdr/>
-        <w:spacing/>
-        <w:ind/>
-        <w:jc w:val="both"/>
-        <w:rPr>
-          <w:sz w:val="24"/>
-          <w:szCs w:val="24"/>
-        </w:rPr>
-      </w:pPr>
-      <w:r>
-        <w:rPr>
-          <w:sz w:val="24"/>
-          <w:szCs w:val="24"/>
-        </w:rPr>
-        <w:tab/>
-      </w:r>
-      <w:r>
-        <w:rPr>
-          <w:sz w:val="24"/>
-          <w:szCs w:val="24"/>
-        </w:rPr>
-        <w:tab/>
-      </w:r>
-      <w:r>
-        <w:rPr>
-          <w:sz w:val="24"/>
-          <w:szCs w:val="24"/>
-        </w:rPr>
-        <w:tab/>
-      </w:r>
-      <w:r>
-        <w:rPr>
-          <w:sz w:val="24"/>
-          <w:szCs w:val="24"/>
-        </w:rPr>
-        <w:tab/>
-      </w:r>
-      <w:r>
-        <w:rPr>
-          <w:sz w:val="24"/>
-          <w:szCs w:val="24"/>
-        </w:rPr>
-        <w:tab/>
-        <w:t xml:space="preserve">  </w:t>
-      </w:r>
-      <w:r>
-        <w:rPr>
-          <w:sz w:val="24"/>
-          <w:szCs w:val="24"/>
-        </w:rPr>
-        <w:t xml:space="preserve">Brian</w:t>
-      </w:r>
-      <w:r>
-        <w:rPr>
-          <w:sz w:val="24"/>
-          <w:szCs w:val="24"/>
-        </w:rPr>
-        <w:t xml:space="preserve"> </w:t>
-      </w:r>
-      <w:r>
-        <w:rPr>
-          <w:sz w:val="24"/>
-          <w:szCs w:val="24"/>
-        </w:rPr>
-        <w:t xml:space="preserve">MUÑIZ</w:t>
-      </w:r>
-      <w:r>
-        <w:rPr>
-          <w:sz w:val="24"/>
-          <w:szCs w:val="24"/>
-        </w:rPr>
-        <w:t xml:space="preserve"> </w:t>
-      </w:r>
       <w:r>
         <w:rPr>
           <w:sz w:val="24"/>
           <w:szCs w:val="24"/>
         </w:rPr>
       </w:r>
+      <w:r>
+        <w:rPr>
+          <w:sz w:val="24"/>
+          <w:szCs w:val="24"/>
+          <w:highlight w:val="none"/>
+        </w:rPr>
+      </w:r>
     </w:p>
     <w:p>
       <w:pPr>
@@ -2307,113 +2540,12 @@
           <w:szCs w:val="24"/>
         </w:rPr>
       </w:pPr>
-      <w:r>
-        <w:rPr>
-          <w:sz w:val="24"/>
-          <w:szCs w:val="24"/>
-        </w:rPr>
-        <w:tab/>
-      </w:r>
-      <w:r>
-        <w:rPr>
-          <w:sz w:val="24"/>
-          <w:szCs w:val="24"/>
-        </w:rPr>
-        <w:tab/>
-      </w:r>
-      <w:r>
-        <w:rPr>
-          <w:sz w:val="24"/>
-          <w:szCs w:val="24"/>
-        </w:rPr>
-        <w:tab/>
-      </w:r>
-      <w:r>
-        <w:rPr>
-          <w:sz w:val="24"/>
-          <w:szCs w:val="24"/>
-        </w:rPr>
-        <w:tab/>
-        <w:t xml:space="preserve">     </w:t>
-      </w:r>
-      <w:r>
-        <w:rPr>
-          <w:sz w:val="24"/>
-          <w:szCs w:val="24"/>
-        </w:rPr>
-        <w:t xml:space="preserve">Depto. Despacho de Buques </w:t>
-      </w:r>
       <w:r>
         <w:rPr>
           <w:sz w:val="24"/>
           <w:szCs w:val="24"/>
         </w:rPr>
       </w:r>
-    </w:p>
-    <w:p>
-      <w:pPr>
-        <w:pBdr/>
-        <w:spacing/>
-        <w:ind/>
-        <w:jc w:val="both"/>
-        <w:rPr>
-          <w:sz w:val="24"/>
-          <w:szCs w:val="24"/>
-        </w:rPr>
-      </w:pPr>
-      <w:r>
-        <w:rPr>
-          <w:sz w:val="24"/>
-          <w:szCs w:val="24"/>
-        </w:rPr>
-        <w:tab/>
-      </w:r>
-      <w:r>
-        <w:rPr>
-          <w:sz w:val="24"/>
-          <w:szCs w:val="24"/>
-        </w:rPr>
-        <w:tab/>
-      </w:r>
-      <w:r>
-        <w:rPr>
-          <w:sz w:val="24"/>
-          <w:szCs w:val="24"/>
-        </w:rPr>
-        <w:tab/>
-      </w:r>
-      <w:r>
-        <w:rPr>
-          <w:sz w:val="24"/>
-          <w:szCs w:val="24"/>
-        </w:rPr>
-        <w:t xml:space="preserve">          </w:t>
-      </w:r>
-      <w:r>
-        <w:rPr>
-          <w:sz w:val="24"/>
-          <w:szCs w:val="24"/>
-        </w:rPr>
-        <w:t xml:space="preserve"> Prefectura del Puerto de Montevideo</w:t>
-      </w:r>
-      <w:r>
-        <w:rPr>
-          <w:sz w:val="24"/>
-          <w:szCs w:val="24"/>
-        </w:rPr>
-      </w:r>
-    </w:p>
-    <w:p>
-      <w:pPr>
-        <w:pBdr/>
-        <w:spacing/>
-        <w:ind/>
-        <w:jc w:val="both"/>
-        <w:rPr>
-          <w:sz w:val="24"/>
-          <w:szCs w:val="24"/>
-        </w:rPr>
-      </w:pPr>
       <w:r>
         <w:rPr>
           <w:sz w:val="24"/>
@@ -2456,7 +2588,6 @@
         <w:pBdr/>
         <w:spacing/>
         <w:ind/>
-        <w:jc w:val="both"/>
         <w:rPr>
           <w:sz w:val="24"/>
           <w:szCs w:val="24"/>
@@ -2467,53 +2598,13 @@
           <w:sz w:val="24"/>
           <w:szCs w:val="24"/>
         </w:rPr>
+        <w:t xml:space="preserve">Interprete: </w:t>
       </w:r>
       <w:r>
         <w:rPr>
           <w:sz w:val="24"/>
           <w:szCs w:val="24"/>
         </w:rPr>
-      </w:r>
-    </w:p>
-    <w:p>
-      <w:pPr>
-        <w:pBdr/>
-        <w:spacing/>
-        <w:ind/>
-        <w:rPr>
-          <w:sz w:val="24"/>
-          <w:szCs w:val="24"/>
-        </w:rPr>
-      </w:pPr>
-      <w:r>
-        <w:rPr>
-          <w:sz w:val="24"/>
-          <w:szCs w:val="24"/>
-        </w:rPr>
-      </w:r>
-      <w:r>
-        <w:rPr>
-          <w:sz w:val="24"/>
-          <w:szCs w:val="24"/>
-        </w:rPr>
-      </w:r>
-    </w:p>
-    <w:p>
-      <w:pPr>
-        <w:pBdr/>
-        <w:spacing/>
-        <w:ind/>
-        <w:rPr>
-          <w:sz w:val="24"/>
-          <w:szCs w:val="24"/>
-        </w:rPr>
-      </w:pPr>
-      <w:r>
-        <w:rPr>
-          <w:sz w:val="24"/>
-          <w:szCs w:val="24"/>
-        </w:rPr>
-        <w:t xml:space="preserve">Interprete: </w:t>
       </w:r>
       <w:r>
         <w:rPr>
@@ -2559,6 +2650,12 @@
           <w:szCs w:val="24"/>
         </w:rPr>
       </w:r>
+      <w:r>
+        <w:rPr>
+          <w:sz w:val="24"/>
+          <w:szCs w:val="24"/>
+        </w:rPr>
+      </w:r>
     </w:p>
     <w:sectPr>
       <w:footnotePr/>
@@ -2656,7 +2753,7 @@
         <w:spacing/>
         <w:ind w:firstLine="0" w:left="0"/>
       </w:pPr>
-      <w:pStyle w:val="703"/>
+      <w:pStyle w:val="721"/>
       <w:rPr/>
       <w:start w:val="1"/>
       <w:suff w:val="nothing"/>
@@ -2674,7 +2771,7 @@
         <w:spacing/>
         <w:ind w:firstLine="0" w:left="0"/>
       </w:pPr>
-      <w:pStyle w:val="704"/>
+      <w:pStyle w:val="722"/>
       <w:rPr/>
       <w:start w:val="1"/>
       <w:suff w:val="nothing"/>
@@ -2692,7 +2789,7 @@
         <w:spacing/>
         <w:ind w:firstLine="0" w:left="0"/>
       </w:pPr>
-      <w:pStyle w:val="705"/>
+      <w:pStyle w:val="723"/>
       <w:rPr/>
       <w:start w:val="1"/>
       <w:suff w:val="nothing"/>
@@ -2710,7 +2807,7 @@
         <w:spacing/>
         <w:ind w:firstLine="0" w:left="0"/>
       </w:pPr>
-      <w:pStyle w:val="706"/>
+      <w:pStyle w:val="724"/>
       <w:rPr/>
       <w:start w:val="1"/>
       <w:suff w:val="nothing"/>
@@ -2728,7 +2825,7 @@
         <w:spacing/>
         <w:ind w:firstLine="0" w:left="0"/>
       </w:pPr>
-      <w:pStyle w:val="707"/>
+      <w:pStyle w:val="725"/>
       <w:rPr/>
       <w:start w:val="1"/>
       <w:suff w:val="nothing"/>
@@ -2746,7 +2843,7 @@
         <w:spacing/>
         <w:ind w:firstLine="0" w:left="0"/>
       </w:pPr>
-      <w:pStyle w:val="708"/>
+      <w:pStyle w:val="726"/>
       <w:rPr/>
       <w:start w:val="1"/>
       <w:suff w:val="nothing"/>
@@ -2764,7 +2861,7 @@
         <w:spacing/>
         <w:ind w:firstLine="0" w:left="0"/>
       </w:pPr>
-      <w:pStyle w:val="709"/>
+      <w:pStyle w:val="727"/>
       <w:rPr/>
       <w:start w:val="1"/>
       <w:suff w:val="nothing"/>
@@ -2782,7 +2879,7 @@
         <w:spacing/>
         <w:ind w:firstLine="0" w:left="0"/>
       </w:pPr>
-      <w:pStyle w:val="710"/>
+      <w:pStyle w:val="728"/>
       <w:rPr/>
       <w:start w:val="1"/>
       <w:suff w:val="nothing"/>
@@ -2800,7 +2897,7 @@
         <w:spacing/>
         <w:ind w:firstLine="0" w:left="0"/>
       </w:pPr>
-      <w:pStyle w:val="711"/>
+      <w:pStyle w:val="729"/>
       <w:rPr/>
       <w:start w:val="1"/>
       <w:suff w:val="nothing"/>
@@ -2967,10 +3064,10 @@
     <w:lsdException w:name="Bibliography" w:uiPriority="37"/>
     <w:lsdException w:name="TOC Heading" w:uiPriority="39" w:qFormat="1"/>
   </w:latentStyles>
-  <w:style w:type="character" w:styleId="150">
+  <w:style w:type="character" w:styleId="703">
     <w:name w:val="Heading 1 Char"/>
-    <w:basedOn w:val="712"/>
-    <w:link w:val="703"/>
+    <w:basedOn w:val="730"/>
+    <w:link w:val="721"/>
     <w:uiPriority w:val="9"/>
     <w:pPr>
       <w:pBdr/>
@@ -2984,10 +3081,10 @@
       <w:szCs w:val="40"/>
     </w:rPr>
   </w:style>
-  <w:style w:type="character" w:styleId="151">
+  <w:style w:type="character" w:styleId="704">
     <w:name w:val="Heading 2 Char"/>
-    <w:basedOn w:val="712"/>
-    <w:link w:val="704"/>
+    <w:basedOn w:val="730"/>
+    <w:link w:val="722"/>
     <w:uiPriority w:val="9"/>
     <w:pPr>
       <w:pBdr/>
@@ -3001,10 +3098,10 @@
       <w:szCs w:val="32"/>
     </w:rPr>
   </w:style>
-  <w:style w:type="character" w:styleId="152">
+  <w:style w:type="character" w:styleId="705">
     <w:name w:val="Heading 3 Char"/>
-    <w:basedOn w:val="712"/>
-    <w:link w:val="705"/>
+    <w:basedOn w:val="730"/>
+    <w:link w:val="723"/>
     <w:uiPriority w:val="9"/>
     <w:pPr>
       <w:pBdr/>
@@ -3018,10 +3115,10 @@
       <w:szCs w:val="28"/>
     </w:rPr>
   </w:style>
-  <w:style w:type="character" w:styleId="153">
+  <w:style w:type="character" w:styleId="706">
     <w:name w:val="Heading 4 Char"/>
-    <w:basedOn w:val="712"/>
-    <w:link w:val="706"/>
+    <w:basedOn w:val="730"/>
+    <w:link w:val="724"/>
     <w:uiPriority w:val="9"/>
     <w:pPr>
       <w:pBdr/>
@@ -3035,10 +3132,10 @@
       <w:color w:val="0f4761" w:themeColor="accent1" w:themeShade="BF"/>
     </w:rPr>
   </w:style>
-  <w:style w:type="character" w:styleId="154">
+  <w:style w:type="character" w:styleId="707">
     <w:name w:val="Heading 5 Char"/>
-    <w:basedOn w:val="712"/>
-    <w:link w:val="707"/>
+    <w:basedOn w:val="730"/>
+    <w:link w:val="725"/>
     <w:uiPriority w:val="9"/>
     <w:pPr>
       <w:pBdr/>
@@ -3050,10 +3147,10 @@
       <w:color w:val="0f4761" w:themeColor="accent1" w:themeShade="BF"/>
     </w:rPr>
   </w:style>
-  <w:style w:type="character" w:styleId="155">
+  <w:style w:type="character" w:styleId="708">
     <w:name w:val="Heading 6 Char"/>
-    <w:basedOn w:val="712"/>
-    <w:link w:val="708"/>
+    <w:basedOn w:val="730"/>
+    <w:link w:val="726"/>
     <w:uiPriority w:val="9"/>
     <w:pPr>
       <w:pBdr/>
@@ -3067,10 +3164,10 @@
       <w:color w:val="595959" w:themeColor="text1" w:themeTint="A6"/>
     </w:rPr>
   </w:style>
-  <w:style w:type="character" w:styleId="156">
+  <w:style w:type="character" w:styleId="709">
     <w:name w:val="Heading 7 Char"/>
-    <w:basedOn w:val="712"/>
-    <w:link w:val="709"/>
+    <w:basedOn w:val="730"/>
+    <w:link w:val="727"/>
     <w:uiPriority w:val="9"/>
     <w:pPr>
       <w:pBdr/>
@@ -3082,10 +3179,10 @@
       <w:color w:val="595959" w:themeColor="text1" w:themeTint="A6"/>
     </w:rPr>
   </w:style>
-  <w:style w:type="character" w:styleId="157">
+  <w:style w:type="character" w:styleId="710">
     <w:name w:val="Heading 8 Char"/>
-    <w:basedOn w:val="712"/>
-    <w:link w:val="710"/>
+    <w:basedOn w:val="730"/>
+    <w:link w:val="728"/>
     <w:uiPriority w:val="9"/>
     <w:pPr>
       <w:pBdr/>
@@ -3099,10 +3196,10 @@
       <w:color w:val="272727" w:themeColor="text1" w:themeTint="D8"/>
     </w:rPr>
   </w:style>
-  <w:style w:type="character" w:styleId="158">
+  <w:style w:type="character" w:styleId="711">
     <w:name w:val="Heading 9 Char"/>
-    <w:basedOn w:val="712"/>
-    <w:link w:val="711"/>
+    <w:basedOn w:val="730"/>
+    <w:link w:val="729"/>
     <w:uiPriority w:val="9"/>
     <w:pPr>
       <w:pBdr/>
@@ -3116,10 +3213,10 @@
       <w:color w:val="272727" w:themeColor="text1" w:themeTint="D8"/>
     </w:rPr>
   </w:style>
-  <w:style w:type="character" w:styleId="160">
+  <w:style w:type="character" w:styleId="712">
     <w:name w:val="Title Char"/>
-    <w:basedOn w:val="712"/>
-    <w:link w:val="850"/>
+    <w:basedOn w:val="730"/>
+    <w:link w:val="868"/>
     <w:uiPriority w:val="10"/>
     <w:pPr>
       <w:pBdr/>
@@ -3133,10 +3230,10 @@
       <w:szCs w:val="56"/>
     </w:rPr>
   </w:style>
-  <w:style w:type="character" w:styleId="162">
+  <w:style w:type="character" w:styleId="713">
     <w:name w:val="Subtitle Char"/>
-    <w:basedOn w:val="712"/>
-    <w:link w:val="852"/>
+    <w:basedOn w:val="730"/>
+    <w:link w:val="870"/>
     <w:uiPriority w:val="11"/>
     <w:pPr>
       <w:pBdr/>
@@ -3150,10 +3247,10 @@
       <w:szCs w:val="28"/>
     </w:rPr>
   </w:style>
-  <w:style w:type="character" w:styleId="164">
+  <w:style w:type="character" w:styleId="714">
     <w:name w:val="Quote Char"/>
-    <w:basedOn w:val="712"/>
-    <w:link w:val="854"/>
+    <w:basedOn w:val="730"/>
+    <w:link w:val="872"/>
     <w:uiPriority w:val="29"/>
     <w:pPr>
       <w:pBdr/>
@@ -3166,10 +3263,10 @@
       <w:color w:val="404040" w:themeColor="text1" w:themeTint="BF"/>
     </w:rPr>
   </w:style>
-  <w:style w:type="character" w:styleId="168">
+  <w:style w:type="character" w:styleId="715">
     <w:name w:val="Intense Quote Char"/>
-    <w:basedOn w:val="712"/>
-    <w:link w:val="858"/>
+    <w:basedOn w:val="730"/>
+    <w:link w:val="876"/>
     <w:uiPriority w:val="30"/>
     <w:pPr>
       <w:pBdr/>
@@ -3182,10 +3279,10 @@
       <w:color w:val="0f4761" w:themeColor="accent1" w:themeShade="BF"/>
     </w:rPr>
   </w:style>
-  <w:style w:type="character" w:styleId="177">
+  <w:style w:type="character" w:styleId="716">
     <w:name w:val="Header Char"/>
-    <w:basedOn w:val="712"/>
-    <w:link w:val="903"/>
+    <w:basedOn w:val="730"/>
+    <w:link w:val="921"/>
     <w:uiPriority w:val="99"/>
     <w:pPr>
       <w:pBdr/>
@@ -3193,10 +3290,10 @@
       <w:ind/>
     </w:pPr>
   </w:style>
-  <w:style w:type="character" w:styleId="179">
+  <w:style w:type="character" w:styleId="717">
     <w:name w:val="Footer Char"/>
-    <w:basedOn w:val="712"/>
-    <w:link w:val="904"/>
+    <w:basedOn w:val="730"/>
+    <w:link w:val="922"/>
     <w:uiPriority w:val="99"/>
     <w:pPr>
       <w:pBdr/>
@@ -3204,10 +3301,10 @@
       <w:ind/>
     </w:pPr>
   </w:style>
-  <w:style w:type="character" w:styleId="182">
+  <w:style w:type="character" w:styleId="718">
     <w:name w:val="Footnote Text Char"/>
-    <w:basedOn w:val="712"/>
-    <w:link w:val="869"/>
+    <w:basedOn w:val="730"/>
+    <w:link w:val="887"/>
     <w:uiPriority w:val="99"/>
     <w:semiHidden/>
     <w:pPr>
@@ -3220,10 +3317,10 @@
       <w:szCs w:val="20"/>
     </w:rPr>
   </w:style>
-  <w:style w:type="character" w:styleId="185">
+  <w:style w:type="character" w:styleId="719">
     <w:name w:val="Endnote Text Char"/>
-    <w:basedOn w:val="712"/>
-    <w:link w:val="872"/>
+    <w:basedOn w:val="730"/>
+    <w:link w:val="890"/>
     <w:uiPriority w:val="99"/>
     <w:semiHidden/>
     <w:pPr>
@@ -3236,7 +3333,7 @@
       <w:szCs w:val="20"/>
     </w:rPr>
   </w:style>
-  <w:style w:type="paragraph" w:styleId="702" w:default="1">
+  <w:style w:type="paragraph" w:styleId="720" w:default="1">
     <w:name w:val="Normal"/>
     <w:pPr>
       <w:pBdr/>
@@ -3247,11 +3344,11 @@
       <w:lang w:val="es-ES"/>
     </w:rPr>
   </w:style>
-  <w:style w:type="paragraph" w:styleId="703">
+  <w:style w:type="paragraph" w:styleId="721">
     <w:name w:val="Heading 1"/>
-    <w:basedOn w:val="702"/>
-    <w:next w:val="702"/>
-    <w:link w:val="841"/>
+    <w:basedOn w:val="720"/>
+    <w:next w:val="720"/>
+    <w:link w:val="859"/>
     <w:pPr>
       <w:keepNext w:val="true"/>
       <w:numPr>
@@ -3267,11 +3364,11 @@
       <w:lang w:val="es-MX"/>
     </w:rPr>
   </w:style>
-  <w:style w:type="paragraph" w:styleId="704">
+  <w:style w:type="paragraph" w:styleId="722">
     <w:name w:val="Heading 2"/>
-    <w:basedOn w:val="702"/>
-    <w:next w:val="702"/>
-    <w:link w:val="842"/>
+    <w:basedOn w:val="720"/>
+    <w:next w:val="720"/>
+    <w:link w:val="860"/>
     <w:pPr>
       <w:keepNext w:val="true"/>
       <w:numPr>
@@ -3288,11 +3385,11 @@
       <w:lang w:val="es-MX"/>
     </w:rPr>
   </w:style>
-  <w:style w:type="paragraph" w:styleId="705">
+  <w:style w:type="paragraph" w:styleId="723">
     <w:name w:val="Heading 3"/>
-    <w:basedOn w:val="702"/>
-    <w:next w:val="702"/>
-    <w:link w:val="843"/>
+    <w:basedOn w:val="720"/>
+    <w:next w:val="720"/>
+    <w:link w:val="861"/>
     <w:pPr>
       <w:keepNext w:val="true"/>
       <w:numPr>
@@ -3310,11 +3407,11 @@
       <w:lang w:val="es-MX"/>
     </w:rPr>
   </w:style>
-  <w:style w:type="paragraph" w:styleId="706">
+  <w:style w:type="paragraph" w:styleId="724">
     <w:name w:val="Heading 4"/>
-    <w:basedOn w:val="702"/>
-    <w:next w:val="702"/>
-    <w:link w:val="844"/>
+    <w:basedOn w:val="720"/>
+    <w:next w:val="720"/>
+    <w:link w:val="862"/>
     <w:pPr>
       <w:keepNext w:val="true"/>
       <w:numPr>
@@ -3336,11 +3433,11 @@
       <w:lang w:val="es-MX"/>
     </w:rPr>
   </w:style>
-  <w:style w:type="paragraph" w:styleId="707">
+  <w:style w:type="paragraph" w:styleId="725">
     <w:name w:val="Heading 5"/>
-    <w:basedOn w:val="702"/>
-    <w:next w:val="702"/>
-    <w:link w:val="845"/>
+    <w:basedOn w:val="720"/>
+    <w:next w:val="720"/>
+    <w:link w:val="863"/>
     <w:pPr>
       <w:keepNext w:val="true"/>
       <w:numPr>
@@ -3358,11 +3455,11 @@
       <w:sz w:val="24"/>
     </w:rPr>
   </w:style>
-  <w:style w:type="paragraph" w:styleId="708">
+  <w:style w:type="paragraph" w:styleId="726">
     <w:name w:val="Heading 6"/>
-    <w:basedOn w:val="702"/>
-    <w:next w:val="702"/>
-    <w:link w:val="846"/>
+    <w:basedOn w:val="720"/>
+    <w:next w:val="720"/>
+    <w:link w:val="864"/>
     <w:pPr>
       <w:keepNext w:val="true"/>
       <w:numPr>
@@ -3379,11 +3476,11 @@
       <w:sz w:val="24"/>
     </w:rPr>
   </w:style>
-  <w:style w:type="paragraph" w:styleId="709">
+  <w:style w:type="paragraph" w:styleId="727">
     <w:name w:val="Heading 7"/>
-    <w:basedOn w:val="702"/>
-    <w:next w:val="702"/>
-    <w:link w:val="847"/>
+    <w:basedOn w:val="720"/>
+    <w:next w:val="720"/>
+    <w:link w:val="865"/>
     <w:pPr>
       <w:keepNext w:val="true"/>
       <w:numPr>
@@ -3400,11 +3497,11 @@
       <w:sz w:val="22"/>
     </w:rPr>
   </w:style>
-  <w:style w:type="paragraph" w:styleId="710">
+  <w:style w:type="paragraph" w:styleId="728">
     <w:name w:val="Heading 8"/>
-    <w:basedOn w:val="702"/>
-    <w:next w:val="702"/>
-    <w:link w:val="848"/>
+    <w:basedOn w:val="720"/>
+    <w:next w:val="720"/>
+    <w:link w:val="866"/>
     <w:pPr>
       <w:keepNext w:val="true"/>
       <w:numPr>
@@ -3424,11 +3521,11 @@
       <w:lang w:val="es-MX"/>
     </w:rPr>
   </w:style>
-  <w:style w:type="paragraph" w:styleId="711">
+  <w:style w:type="paragraph" w:styleId="729">
     <w:name w:val="Heading 9"/>
-    <w:basedOn w:val="702"/>
-    <w:next w:val="702"/>
-    <w:link w:val="849"/>
+    <w:basedOn w:val="720"/>
+    <w:next w:val="720"/>
+    <w:link w:val="867"/>
     <w:pPr>
       <w:keepNext w:val="true"/>
       <w:numPr>
@@ -3447,7 +3544,7 @@
       <w:sz w:val="24"/>
     </w:rPr>
   </w:style>
-  <w:style w:type="character" w:styleId="712" w:default="1">
+  <w:style w:type="character" w:styleId="730" w:default="1">
     <w:name w:val="Default Paragraph Font"/>
     <w:uiPriority w:val="1"/>
     <w:semiHidden/>
@@ -3458,7 +3555,7 @@
       <w:ind/>
     </w:pPr>
   </w:style>
-  <w:style w:type="table" w:styleId="713" w:default="1">
+  <w:style w:type="table" w:styleId="731" w:default="1">
     <w:name w:val="Normal Table"/>
     <w:uiPriority w:val="99"/>
     <w:semiHidden/>
@@ -3651,7 +3748,7 @@
       </w:tcPr>
     </w:tblStylePr>
   </w:style>
-  <w:style w:type="numbering" w:styleId="714" w:default="1">
+  <w:style w:type="numbering" w:styleId="732" w:default="1">
     <w:name w:val="No List"/>
     <w:uiPriority w:val="99"/>
     <w:semiHidden/>
@@ -3662,9 +3759,9 @@
       <w:ind/>
     </w:pPr>
   </w:style>
-  <w:style w:type="table" w:styleId="715">
+  <w:style w:type="table" w:styleId="733">
     <w:name w:val="Table Grid"/>
-    <w:basedOn w:val="713"/>
+    <w:basedOn w:val="731"/>
     <w:uiPriority w:val="59"/>
     <w:pPr>
       <w:pBdr/>
@@ -3854,9 +3951,9 @@
       </w:tcPr>
     </w:tblStylePr>
   </w:style>
-  <w:style w:type="table" w:styleId="716" w:customStyle="1">
+  <w:style w:type="table" w:styleId="734" w:customStyle="1">
     <w:name w:val="Table Grid Light"/>
-    <w:basedOn w:val="713"/>
+    <w:basedOn w:val="731"/>
     <w:uiPriority w:val="59"/>
     <w:pPr>
       <w:pBdr/>
@@ -4046,9 +4143,9 @@
       </w:tcPr>
     </w:tblStylePr>
   </w:style>
-  <w:style w:type="table" w:styleId="717">
+  <w:style w:type="table" w:styleId="735">
     <w:name w:val="Plain Table 1"/>
-    <w:basedOn w:val="713"/>
+    <w:basedOn w:val="731"/>
     <w:uiPriority w:val="59"/>
     <w:pPr>
       <w:pBdr/>
@@ -4264,9 +4361,9 @@
       </w:tcPr>
     </w:tblStylePr>
   </w:style>
-  <w:style w:type="table" w:styleId="718">
+  <w:style w:type="table" w:styleId="736">
     <w:name w:val="Plain Table 2"/>
-    <w:basedOn w:val="713"/>
+    <w:basedOn w:val="731"/>
     <w:uiPriority w:val="59"/>
     <w:pPr>
       <w:pBdr/>
@@ -4490,9 +4587,9 @@
       </w:tcPr>
     </w:tblStylePr>
   </w:style>
-  <w:style w:type="table" w:styleId="719">
+  <w:style w:type="table" w:styleId="737">
     <w:name w:val="Plain Table 3"/>
-    <w:basedOn w:val="713"/>
+    <w:basedOn w:val="731"/>
     <w:uiPriority w:val="99"/>
     <w:pPr>
       <w:pBdr/>
@@ -4719,9 +4816,9 @@
       </w:tcPr>
     </w:tblStylePr>
   </w:style>
-  <w:style w:type="table" w:styleId="720">
+  <w:style w:type="table" w:styleId="738">
     <w:name w:val="Plain Table 4"/>
-    <w:basedOn w:val="713"/>
+    <w:basedOn w:val="731"/>
     <w:uiPriority w:val="99"/>
     <w:pPr>
       <w:pBdr/>
@@ -4934,9 +5031,9 @@
       </w:tcPr>
     </w:tblStylePr>
   </w:style>
-  <w:style w:type="table" w:styleId="721">
+  <w:style w:type="table" w:styleId="739">
     <w:name w:val="Plain Table 5"/>
-    <w:basedOn w:val="713"/>
+    <w:basedOn w:val="731"/>
     <w:uiPriority w:val="99"/>
     <w:pPr>
       <w:pBdr/>
@@ -5166,9 +5263,9 @@
       </w:tcPr>
     </w:tblStylePr>
   </w:style>
-  <w:style w:type="table" w:styleId="722">
+  <w:style w:type="table" w:styleId="740">
     <w:name w:val="Grid Table 1 Light"/>
-    <w:basedOn w:val="713"/>
+    <w:basedOn w:val="731"/>
     <w:uiPriority w:val="99"/>
     <w:pPr>
       <w:pBdr/>
@@ -5388,9 +5485,9 @@
       </w:tcPr>
     </w:tblStylePr>
   </w:style>
-  <w:style w:type="table" w:styleId="723" w:customStyle="1">
+  <w:style w:type="table" w:styleId="741" w:customStyle="1">
     <w:name w:val="Grid Table 1 Light - Accent 1"/>
-    <w:basedOn w:val="713"/>
+    <w:basedOn w:val="731"/>
     <w:uiPriority w:val="99"/>
     <w:pPr>
       <w:pBdr/>
@@ -5610,9 +5707,9 @@
       </w:tcPr>
     </w:tblStylePr>
   </w:style>
-  <w:style w:type="table" w:styleId="724" w:customStyle="1">
+  <w:style w:type="table" w:styleId="742" w:customStyle="1">
     <w:name w:val="Grid Table 1 Light - Accent 2"/>
-    <w:basedOn w:val="713"/>
+    <w:basedOn w:val="731"/>
     <w:uiPriority w:val="99"/>
     <w:pPr>
       <w:pBdr/>
@@ -5832,9 +5929,9 @@
       </w:tcPr>
     </w:tblStylePr>
   </w:style>
-  <w:style w:type="table" w:styleId="725" w:customStyle="1">
+  <w:style w:type="table" w:styleId="743" w:customStyle="1">
     <w:name w:val="Grid Table 1 Light - Accent 3"/>
-    <w:basedOn w:val="713"/>
+    <w:basedOn w:val="731"/>
     <w:uiPriority w:val="99"/>
     <w:pPr>
       <w:pBdr/>
@@ -6054,9 +6151,9 @@
       </w:tcPr>
     </w:tblStylePr>
   </w:style>
-  <w:style w:type="table" w:styleId="726" w:customStyle="1">
+  <w:style w:type="table" w:styleId="744" w:customStyle="1">
     <w:name w:val="Grid Table 1 Light - Accent 4"/>
-    <w:basedOn w:val="713"/>
+    <w:basedOn w:val="731"/>
     <w:uiPriority w:val="99"/>
     <w:pPr>
       <w:pBdr/>
@@ -6276,9 +6373,9 @@
       </w:tcPr>
     </w:tblStylePr>
   </w:style>
-  <w:style w:type="table" w:styleId="727" w:customStyle="1">
+  <w:style w:type="table" w:styleId="745" w:customStyle="1">
     <w:name w:val="Grid Table 1 Light - Accent 5"/>
-    <w:basedOn w:val="713"/>
+    <w:basedOn w:val="731"/>
     <w:uiPriority w:val="99"/>
     <w:pPr>
       <w:pBdr/>
@@ -6498,9 +6595,9 @@
       </w:tcPr>
     </w:tblStylePr>
   </w:style>
-  <w:style w:type="table" w:styleId="728" w:customStyle="1">
+  <w:style w:type="table" w:styleId="746" w:customStyle="1">
     <w:name w:val="Grid Table 1 Light - Accent 6"/>
-    <w:basedOn w:val="713"/>
+    <w:basedOn w:val="731"/>
     <w:uiPriority w:val="99"/>
     <w:pPr>
       <w:pBdr/>
@@ -6720,9 +6817,9 @@
       </w:tcPr>
     </w:tblStylePr>
   </w:style>
-  <w:style w:type="table" w:styleId="729">
+  <w:style w:type="table" w:styleId="747">
     <w:name w:val="Grid Table 2"/>
-    <w:basedOn w:val="713"/>
+    <w:basedOn w:val="731"/>
     <w:uiPriority w:val="99"/>
     <w:pPr>
       <w:pBdr/>
@@ -6951,9 +7048,9 @@
       </w:tcPr>
     </w:tblStylePr>
   </w:style>
-  <w:style w:type="table" w:styleId="730" w:customStyle="1">
+  <w:style w:type="table" w:styleId="748" w:customStyle="1">
     <w:name w:val="Grid Table 2 - Accent 1"/>
-    <w:basedOn w:val="713"/>
+    <w:basedOn w:val="731"/>
     <w:uiPriority w:val="99"/>
     <w:pPr>
       <w:pBdr/>
@@ -7182,9 +7279,9 @@
       </w:tcPr>
     </w:tblStylePr>
   </w:style>
-  <w:style w:type="table" w:styleId="731" w:customStyle="1">
+  <w:style w:type="table" w:styleId="749" w:customStyle="1">
     <w:name w:val="Grid Table 2 - Accent 2"/>
-    <w:basedOn w:val="713"/>
+    <w:basedOn w:val="731"/>
     <w:uiPriority w:val="99"/>
     <w:pPr>
       <w:pBdr/>
@@ -7413,9 +7510,9 @@
       </w:tcPr>
     </w:tblStylePr>
   </w:style>
-  <w:style w:type="table" w:styleId="732" w:customStyle="1">
+  <w:style w:type="table" w:styleId="750" w:customStyle="1">
     <w:name w:val="Grid Table 2 - Accent 3"/>
-    <w:basedOn w:val="713"/>
+    <w:basedOn w:val="731"/>
     <w:uiPriority w:val="99"/>
     <w:pPr>
       <w:pBdr/>
@@ -7644,9 +7741,9 @@
       </w:tcPr>
     </w:tblStylePr>
   </w:style>
-  <w:style w:type="table" w:styleId="733" w:customStyle="1">
+  <w:style w:type="table" w:styleId="751" w:customStyle="1">
     <w:name w:val="Grid Table 2 - Accent 4"/>
-    <w:basedOn w:val="713"/>
+    <w:basedOn w:val="731"/>
     <w:uiPriority w:val="99"/>
     <w:pPr>
       <w:pBdr/>
@@ -7875,9 +7972,9 @@
       </w:tcPr>
     </w:tblStylePr>
   </w:style>
-  <w:style w:type="table" w:styleId="734" w:customStyle="1">
+  <w:style w:type="table" w:styleId="752" w:customStyle="1">
     <w:name w:val="Grid Table 2 - Accent 5"/>
-    <w:basedOn w:val="713"/>
+    <w:basedOn w:val="731"/>
     <w:uiPriority w:val="99"/>
     <w:pPr>
       <w:pBdr/>
@@ -8106,9 +8203,9 @@
       </w:tcPr>
     </w:tblStylePr>
   </w:style>
-  <w:style w:type="table" w:styleId="735" w:customStyle="1">
+  <w:style w:type="table" w:styleId="753" w:customStyle="1">
     <w:name w:val="Grid Table 2 - Accent 6"/>
-    <w:basedOn w:val="713"/>
+    <w:basedOn w:val="731"/>
     <w:uiPriority w:val="99"/>
     <w:pPr>
       <w:pBdr/>
@@ -8337,9 +8434,9 @@
       </w:tcPr>
     </w:tblStylePr>
   </w:style>
-  <w:style w:type="table" w:styleId="736">
+  <w:style w:type="table" w:styleId="754">
     <w:name w:val="Grid Table 3"/>
-    <w:basedOn w:val="713"/>
+    <w:basedOn w:val="731"/>
     <w:uiPriority w:val="99"/>
     <w:pPr>
       <w:pBdr/>
@@ -8581,9 +8678,9 @@
       </w:tcPr>
     </w:tblStylePr>
   </w:style>
-  <w:style w:type="table" w:styleId="737" w:customStyle="1">
+  <w:style w:type="table" w:styleId="755" w:customStyle="1">
     <w:name w:val="Grid Table 3 - Accent 1"/>
-    <w:basedOn w:val="713"/>
+    <w:basedOn w:val="731"/>
     <w:uiPriority w:val="99"/>
     <w:pPr>
       <w:pBdr/>
@@ -8825,9 +8922,9 @@
       </w:tcPr>
     </w:tblStylePr>
   </w:style>
-  <w:style w:type="table" w:styleId="738" w:customStyle="1">
+  <w:style w:type="table" w:styleId="756" w:customStyle="1">
     <w:name w:val="Grid Table 3 - Accent 2"/>
-    <w:basedOn w:val="713"/>
+    <w:basedOn w:val="731"/>
     <w:uiPriority w:val="99"/>
     <w:pPr>
       <w:pBdr/>
@@ -9069,9 +9166,9 @@
       </w:tcPr>
     </w:tblStylePr>
   </w:style>
-  <w:style w:type="table" w:styleId="739" w:customStyle="1">
+  <w:style w:type="table" w:styleId="757" w:customStyle="1">
     <w:name w:val="Grid Table 3 - Accent 3"/>
-    <w:basedOn w:val="713"/>
+    <w:basedOn w:val="731"/>
     <w:uiPriority w:val="99"/>
     <w:pPr>
       <w:pBdr/>
@@ -9313,9 +9410,9 @@
       </w:tcPr>
     </w:tblStylePr>
   </w:style>
-  <w:style w:type="table" w:styleId="740" w:customStyle="1">
+  <w:style w:type="table" w:styleId="758" w:customStyle="1">
     <w:name w:val="Grid Table 3 - Accent 4"/>
-    <w:basedOn w:val="713"/>
+    <w:basedOn w:val="731"/>
     <w:uiPriority w:val="99"/>
     <w:pPr>
       <w:pBdr/>
@@ -9557,9 +9654,9 @@
       </w:tcPr>
     </w:tblStylePr>
   </w:style>
-  <w:style w:type="table" w:styleId="741" w:customStyle="1">
+  <w:style w:type="table" w:styleId="759" w:customStyle="1">
     <w:name w:val="Grid Table 3 - Accent 5"/>
-    <w:basedOn w:val="713"/>
+    <w:basedOn w:val="731"/>
     <w:uiPriority w:val="99"/>
     <w:pPr>
       <w:pBdr/>
@@ -9801,9 +9898,9 @@
       </w:tcPr>
     </w:tblStylePr>
   </w:style>
-  <w:style w:type="table" w:styleId="742" w:customStyle="1">
+  <w:style w:type="table" w:styleId="760" w:customStyle="1">
     <w:name w:val="Grid Table 3 - Accent 6"/>
-    <w:basedOn w:val="713"/>
+    <w:basedOn w:val="731"/>
     <w:uiPriority w:val="99"/>
     <w:pPr>
       <w:pBdr/>
@@ -10045,9 +10142,9 @@
       </w:tcPr>
     </w:tblStylePr>
   </w:style>
-  <w:style w:type="table" w:styleId="743">
+  <w:style w:type="table" w:styleId="761">
     <w:name w:val="Grid Table 4"/>
-    <w:basedOn w:val="713"/>
+    <w:basedOn w:val="731"/>
     <w:uiPriority w:val="59"/>
     <w:pPr>
       <w:pBdr/>
@@ -10277,9 +10374,9 @@
       </w:tcPr>
     </w:tblStylePr>
   </w:style>
-  <w:style w:type="table" w:styleId="744" w:customStyle="1">
+  <w:style w:type="table" w:styleId="762" w:customStyle="1">
     <w:name w:val="Grid Table 4 - Accent 1"/>
-    <w:basedOn w:val="713"/>
+    <w:basedOn w:val="731"/>
     <w:uiPriority w:val="59"/>
     <w:pPr>
       <w:pBdr/>
@@ -10509,9 +10606,9 @@
       </w:tcPr>
     </w:tblStylePr>
   </w:style>
-  <w:style w:type="table" w:styleId="745" w:customStyle="1">
+  <w:style w:type="table" w:styleId="763" w:customStyle="1">
     <w:name w:val="Grid Table 4 - Accent 2"/>
-    <w:basedOn w:val="713"/>
+    <w:basedOn w:val="731"/>
     <w:uiPriority w:val="59"/>
     <w:pPr>
       <w:pBdr/>
@@ -10741,9 +10838,9 @@
       </w:tcPr>
     </w:tblStylePr>
   </w:style>
-  <w:style w:type="table" w:styleId="746" w:customStyle="1">
+  <w:style w:type="table" w:styleId="764" w:customStyle="1">
     <w:name w:val="Grid Table 4 - Accent 3"/>
-    <w:basedOn w:val="713"/>
+    <w:basedOn w:val="731"/>
     <w:uiPriority w:val="59"/>
     <w:pPr>
       <w:pBdr/>
@@ -10973,9 +11070,9 @@
       </w:tcPr>
     </w:tblStylePr>
   </w:style>
-  <w:style w:type="table" w:styleId="747" w:customStyle="1">
+  <w:style w:type="table" w:styleId="765" w:customStyle="1">
     <w:name w:val="Grid Table 4 - Accent 4"/>
-    <w:basedOn w:val="713"/>
+    <w:basedOn w:val="731"/>
     <w:uiPriority w:val="59"/>
     <w:pPr>
       <w:pBdr/>
@@ -11205,9 +11302,9 @@
       </w:tcPr>
     </w:tblStylePr>
   </w:style>
-  <w:style w:type="table" w:styleId="748" w:customStyle="1">
+  <w:style w:type="table" w:styleId="766" w:customStyle="1">
     <w:name w:val="Grid Table 4 - Accent 5"/>
-    <w:basedOn w:val="713"/>
+    <w:basedOn w:val="731"/>
     <w:uiPriority w:val="59"/>
     <w:pPr>
       <w:pBdr/>
@@ -11437,9 +11534,9 @@
       </w:tcPr>
     </w:tblStylePr>
   </w:style>
-  <w:style w:type="table" w:styleId="749" w:customStyle="1">
+  <w:style w:type="table" w:styleId="767" w:customStyle="1">
     <w:name w:val="Grid Table 4 - Accent 6"/>
-    <w:basedOn w:val="713"/>
+    <w:basedOn w:val="731"/>
     <w:uiPriority w:val="59"/>
     <w:pPr>
       <w:pBdr/>
@@ -11669,9 +11766,9 @@
       </w:tcPr>
     </w:tblStylePr>
   </w:style>
-  <w:style w:type="table" w:styleId="750">
+  <w:style w:type="table" w:styleId="768">
     <w:name w:val="Grid Table 5 Dark"/>
-    <w:basedOn w:val="713"/>
+    <w:basedOn w:val="731"/>
     <w:uiPriority w:val="99"/>
     <w:pPr>
       <w:pBdr/>
@@ -11896,9 +11993,9 @@
       </w:tcPr>
     </w:tblStylePr>
   </w:style>
-  <w:style w:type="table" w:styleId="751" w:customStyle="1">
+  <w:style w:type="table" w:styleId="769" w:customStyle="1">
     <w:name w:val="Grid Table 5 Dark- Accent 1"/>
-    <w:basedOn w:val="713"/>
+    <w:basedOn w:val="731"/>
     <w:uiPriority w:val="99"/>
     <w:pPr>
       <w:pBdr/>
@@ -12123,9 +12220,9 @@
       </w:tcPr>
     </w:tblStylePr>
   </w:style>
-  <w:style w:type="table" w:styleId="752" w:customStyle="1">
+  <w:style w:type="table" w:styleId="770" w:customStyle="1">
     <w:name w:val="Grid Table 5 Dark - Accent 2"/>
-    <w:basedOn w:val="713"/>
+    <w:basedOn w:val="731"/>
     <w:uiPriority w:val="99"/>
     <w:pPr>
       <w:pBdr/>
@@ -12350,9 +12447,9 @@
       </w:tcPr>
     </w:tblStylePr>
   </w:style>
-  <w:style w:type="table" w:styleId="753" w:customStyle="1">
+  <w:style w:type="table" w:styleId="771" w:customStyle="1">
     <w:name w:val="Grid Table 5 Dark - Accent 3"/>
-    <w:basedOn w:val="713"/>
+    <w:basedOn w:val="731"/>
     <w:uiPriority w:val="99"/>
     <w:pPr>
       <w:pBdr/>
@@ -12577,9 +12674,9 @@
       </w:tcPr>
     </w:tblStylePr>
   </w:style>
-  <w:style w:type="table" w:styleId="754" w:customStyle="1">
+  <w:style w:type="table" w:styleId="772" w:customStyle="1">
     <w:name w:val="Grid Table 5 Dark- Accent 4"/>
-    <w:basedOn w:val="713"/>
+    <w:basedOn w:val="731"/>
     <w:uiPriority w:val="99"/>
     <w:pPr>
       <w:pBdr/>
@@ -12804,9 +12901,9 @@
       </w:tcPr>
     </w:tblStylePr>
   </w:style>
-  <w:style w:type="table" w:styleId="755" w:customStyle="1">
+  <w:style w:type="table" w:styleId="773" w:customStyle="1">
     <w:name w:val="Grid Table 5 Dark - Accent 5"/>
-    <w:basedOn w:val="713"/>
+    <w:basedOn w:val="731"/>
     <w:uiPriority w:val="99"/>
     <w:pPr>
       <w:pBdr/>
@@ -13031,9 +13128,9 @@
       </w:tcPr>
     </w:tblStylePr>
   </w:style>
-  <w:style w:type="table" w:styleId="756" w:customStyle="1">
+  <w:style w:type="table" w:styleId="774" w:customStyle="1">
     <w:name w:val="Grid Table 5 Dark - Accent 6"/>
-    <w:basedOn w:val="713"/>
+    <w:basedOn w:val="731"/>
     <w:uiPriority w:val="99"/>
     <w:pPr>
       <w:pBdr/>
@@ -13258,9 +13355,9 @@
       </w:tcPr>
     </w:tblStylePr>
   </w:style>
-  <w:style w:type="table" w:styleId="757">
+  <w:style w:type="table" w:styleId="775">
     <w:name w:val="Grid Table 6 Colorful"/>
-    <w:basedOn w:val="713"/>
+    <w:basedOn w:val="731"/>
     <w:uiPriority w:val="99"/>
     <w:pPr>
       <w:pBdr/>
@@ -13482,9 +13579,9 @@
       </w:tcPr>
     </w:tblStylePr>
   </w:style>
-  <w:style w:type="table" w:styleId="758" w:customStyle="1">
+  <w:style w:type="table" w:styleId="776" w:customStyle="1">
     <w:name w:val="Grid Table 6 Colorful - Accent 1"/>
-    <w:basedOn w:val="713"/>
+    <w:basedOn w:val="731"/>
     <w:uiPriority w:val="99"/>
     <w:pPr>
       <w:pBdr/>
@@ -13706,9 +13803,9 @@
       </w:tcPr>
     </w:tblStylePr>
   </w:style>
-  <w:style w:type="table" w:styleId="759" w:customStyle="1">
+  <w:style w:type="table" w:styleId="777" w:customStyle="1">
     <w:name w:val="Grid Table 6 Colorful - Accent 2"/>
-    <w:basedOn w:val="713"/>
+    <w:basedOn w:val="731"/>
     <w:uiPriority w:val="99"/>
     <w:pPr>
       <w:pBdr/>
@@ -13930,9 +14027,9 @@
       </w:tcPr>
     </w:tblStylePr>
   </w:style>
-  <w:style w:type="table" w:styleId="760" w:customStyle="1">
+  <w:style w:type="table" w:styleId="778" w:customStyle="1">
     <w:name w:val="Grid Table 6 Colorful - Accent 3"/>
-    <w:basedOn w:val="713"/>
+    <w:basedOn w:val="731"/>
     <w:uiPriority w:val="99"/>
     <w:pPr>
       <w:pBdr/>
@@ -14154,9 +14251,9 @@
       </w:tcPr>
     </w:tblStylePr>
   </w:style>
-  <w:style w:type="table" w:styleId="761" w:customStyle="1">
+  <w:style w:type="table" w:styleId="779" w:customStyle="1">
     <w:name w:val="Grid Table 6 Colorful - Accent 4"/>
-    <w:basedOn w:val="713"/>
+    <w:basedOn w:val="731"/>
     <w:uiPriority w:val="99"/>
     <w:pPr>
       <w:pBdr/>
@@ -14378,9 +14475,9 @@
       </w:tcPr>
     </w:tblStylePr>
   </w:style>
-  <w:style w:type="table" w:styleId="762" w:customStyle="1">
+  <w:style w:type="table" w:styleId="780" w:customStyle="1">
     <w:name w:val="Grid Table 6 Colorful - Accent 5"/>
-    <w:basedOn w:val="713"/>
+    <w:basedOn w:val="731"/>
     <w:uiPriority w:val="99"/>
     <w:pPr>
       <w:pBdr/>
@@ -14602,9 +14699,9 @@
       </w:tcPr>
     </w:tblStylePr>
   </w:style>
-  <w:style w:type="table" w:styleId="763" w:customStyle="1">
+  <w:style w:type="table" w:styleId="781" w:customStyle="1">
     <w:name w:val="Grid Table 6 Colorful - Accent 6"/>
-    <w:basedOn w:val="713"/>
+    <w:basedOn w:val="731"/>
     <w:uiPriority w:val="99"/>
     <w:pPr>
       <w:pBdr/>
@@ -14826,9 +14923,9 @@
       </w:tcPr>
     </w:tblStylePr>
   </w:style>
-  <w:style w:type="table" w:styleId="764">
+  <w:style w:type="table" w:styleId="782">
     <w:name w:val="Grid Table 7 Colorful"/>
-    <w:basedOn w:val="713"/>
+    <w:basedOn w:val="731"/>
     <w:uiPriority w:val="99"/>
     <w:pPr>
       <w:pBdr/>
@@ -15079,9 +15176,9 @@
       </w:tcPr>
     </w:tblStylePr>
   </w:style>
-  <w:style w:type="table" w:styleId="765" w:customStyle="1">
+  <w:style w:type="table" w:styleId="783" w:customStyle="1">
     <w:name w:val="Grid Table 7 Colorful - Accent 1"/>
-    <w:basedOn w:val="713"/>
+    <w:basedOn w:val="731"/>
     <w:uiPriority w:val="99"/>
     <w:pPr>
       <w:pBdr/>
@@ -15332,9 +15429,9 @@
       </w:tcPr>
     </w:tblStylePr>
   </w:style>
-  <w:style w:type="table" w:styleId="766" w:customStyle="1">
+  <w:style w:type="table" w:styleId="784" w:customStyle="1">
     <w:name w:val="Grid Table 7 Colorful - Accent 2"/>
-    <w:basedOn w:val="713"/>
+    <w:basedOn w:val="731"/>
     <w:uiPriority w:val="99"/>
     <w:pPr>
       <w:pBdr/>
@@ -15585,9 +15682,9 @@
       </w:tcPr>
     </w:tblStylePr>
   </w:style>
-  <w:style w:type="table" w:styleId="767" w:customStyle="1">
+  <w:style w:type="table" w:styleId="785" w:customStyle="1">
     <w:name w:val="Grid Table 7 Colorful - Accent 3"/>
-    <w:basedOn w:val="713"/>
+    <w:basedOn w:val="731"/>
     <w:uiPriority w:val="99"/>
     <w:pPr>
       <w:pBdr/>
@@ -15838,9 +15935,9 @@
       </w:tcPr>
     </w:tblStylePr>
   </w:style>
-  <w:style w:type="table" w:styleId="768" w:customStyle="1">
+  <w:style w:type="table" w:styleId="786" w:customStyle="1">
     <w:name w:val="Grid Table 7 Colorful - Accent 4"/>
-    <w:basedOn w:val="713"/>
+    <w:basedOn w:val="731"/>
     <w:uiPriority w:val="99"/>
     <w:pPr>
       <w:pBdr/>
@@ -16091,9 +16188,9 @@
       </w:tcPr>
     </w:tblStylePr>
   </w:style>
-  <w:style w:type="table" w:styleId="769" w:customStyle="1">
+  <w:style w:type="table" w:styleId="787" w:customStyle="1">
     <w:name w:val="Grid Table 7 Colorful - Accent 5"/>
-    <w:basedOn w:val="713"/>
+    <w:basedOn w:val="731"/>
     <w:uiPriority w:val="99"/>
     <w:pPr>
       <w:pBdr/>
@@ -16344,9 +16441,9 @@
       </w:tcPr>
     </w:tblStylePr>
   </w:style>
-  <w:style w:type="table" w:styleId="770" w:customStyle="1">
+  <w:style w:type="table" w:styleId="788" w:customStyle="1">
     <w:name w:val="Grid Table 7 Colorful - Accent 6"/>
-    <w:basedOn w:val="713"/>
+    <w:basedOn w:val="731"/>
     <w:uiPriority w:val="99"/>
     <w:pPr>
       <w:pBdr/>
@@ -16597,9 +16694,9 @@
       </w:tcPr>
     </w:tblStylePr>
   </w:style>
-  <w:style w:type="table" w:styleId="771">
+  <w:style w:type="table" w:styleId="789">
     <w:name w:val="List Table 1 Light"/>
-    <w:basedOn w:val="713"/>
+    <w:basedOn w:val="731"/>
     <w:uiPriority w:val="99"/>
     <w:pPr>
       <w:pBdr/>
@@ -16812,9 +16909,9 @@
       </w:tcPr>
     </w:tblStylePr>
   </w:style>
-  <w:style w:type="table" w:styleId="772" w:customStyle="1">
+  <w:style w:type="table" w:styleId="790" w:customStyle="1">
     <w:name w:val="List Table 1 Light - Accent 1"/>
-    <w:basedOn w:val="713"/>
+    <w:basedOn w:val="731"/>
     <w:uiPriority w:val="99"/>
     <w:pPr>
       <w:pBdr/>
@@ -17027,9 +17124,9 @@
       </w:tcPr>
     </w:tblStylePr>
   </w:style>
-  <w:style w:type="table" w:styleId="773" w:customStyle="1">
+  <w:style w:type="table" w:styleId="791" w:customStyle="1">
     <w:name w:val="List Table 1 Light - Accent 2"/>
-    <w:basedOn w:val="713"/>
+    <w:basedOn w:val="731"/>
     <w:uiPriority w:val="99"/>
     <w:pPr>
       <w:pBdr/>
@@ -17242,9 +17339,9 @@
       </w:tcPr>
     </w:tblStylePr>
   </w:style>
-  <w:style w:type="table" w:styleId="774" w:customStyle="1">
+  <w:style w:type="table" w:styleId="792" w:customStyle="1">
     <w:name w:val="List Table 1 Light - Accent 3"/>
-    <w:basedOn w:val="713"/>
+    <w:basedOn w:val="731"/>
     <w:uiPriority w:val="99"/>
     <w:pPr>
       <w:pBdr/>
@@ -17457,9 +17554,9 @@
       </w:tcPr>
     </w:tblStylePr>
   </w:style>
-  <w:style w:type="table" w:styleId="775" w:customStyle="1">
+  <w:style w:type="table" w:styleId="793" w:customStyle="1">
     <w:name w:val="List Table 1 Light - Accent 4"/>
-    <w:basedOn w:val="713"/>
+    <w:basedOn w:val="731"/>
     <w:uiPriority w:val="99"/>
     <w:pPr>
       <w:pBdr/>
@@ -17672,9 +17769,9 @@
       </w:tcPr>
     </w:tblStylePr>
   </w:style>
-  <w:style w:type="table" w:styleId="776" w:customStyle="1">
+  <w:style w:type="table" w:styleId="794" w:customStyle="1">
     <w:name w:val="List Table 1 Light - Accent 5"/>
-    <w:basedOn w:val="713"/>
+    <w:basedOn w:val="731"/>
     <w:uiPriority w:val="99"/>
     <w:pPr>
       <w:pBdr/>
@@ -17887,9 +17984,9 @@
       </w:tcPr>
     </w:tblStylePr>
   </w:style>
-  <w:style w:type="table" w:styleId="777" w:customStyle="1">
+  <w:style w:type="table" w:styleId="795" w:customStyle="1">
     <w:name w:val="List Table 1 Light - Accent 6"/>
-    <w:basedOn w:val="713"/>
+    <w:basedOn w:val="731"/>
     <w:uiPriority w:val="99"/>
     <w:pPr>
       <w:pBdr/>
@@ -18102,9 +18199,9 @@
       </w:tcPr>
     </w:tblStylePr>
   </w:style>
-  <w:style w:type="table" w:styleId="778">
+  <w:style w:type="table" w:styleId="796">
     <w:name w:val="List Table 2"/>
-    <w:basedOn w:val="713"/>
+    <w:basedOn w:val="731"/>
     <w:uiPriority w:val="99"/>
     <w:pPr>
       <w:pBdr/>
@@ -18339,9 +18436,9 @@
       </w:tcPr>
     </w:tblStylePr>
   </w:style>
-  <w:style w:type="table" w:styleId="779" w:customStyle="1">
+  <w:style w:type="table" w:styleId="797" w:customStyle="1">
     <w:name w:val="List Table 2 - Accent 1"/>
-    <w:basedOn w:val="713"/>
+    <w:basedOn w:val="731"/>
     <w:uiPriority w:val="99"/>
     <w:pPr>
       <w:pBdr/>
@@ -18576,9 +18673,9 @@
       </w:tcPr>
     </w:tblStylePr>
   </w:style>
-  <w:style w:type="table" w:styleId="780" w:customStyle="1">
+  <w:style w:type="table" w:styleId="798" w:customStyle="1">
     <w:name w:val="List Table 2 - Accent 2"/>
-    <w:basedOn w:val="713"/>
+    <w:basedOn w:val="731"/>
     <w:uiPriority w:val="99"/>
     <w:pPr>
       <w:pBdr/>
@@ -18813,9 +18910,9 @@
       </w:tcPr>
     </w:tblStylePr>
   </w:style>
-  <w:style w:type="table" w:styleId="781" w:customStyle="1">
+  <w:style w:type="table" w:styleId="799" w:customStyle="1">
     <w:name w:val="List Table 2 - Accent 3"/>
-    <w:basedOn w:val="713"/>
+    <w:basedOn w:val="731"/>
     <w:uiPriority w:val="99"/>
     <w:pPr>
       <w:pBdr/>
@@ -19050,9 +19147,9 @@
       </w:tcPr>
     </w:tblStylePr>
   </w:style>
-  <w:style w:type="table" w:styleId="782" w:customStyle="1">
+  <w:style w:type="table" w:styleId="800" w:customStyle="1">
     <w:name w:val="List Table 2 - Accent 4"/>
-    <w:basedOn w:val="713"/>
+    <w:basedOn w:val="731"/>
     <w:uiPriority w:val="99"/>
     <w:pPr>
       <w:pBdr/>
@@ -19287,9 +19384,9 @@
       </w:tcPr>
     </w:tblStylePr>
   </w:style>
-  <w:style w:type="table" w:styleId="783" w:customStyle="1">
+  <w:style w:type="table" w:styleId="801" w:customStyle="1">
     <w:name w:val="List Table 2 - Accent 5"/>
-    <w:basedOn w:val="713"/>
+    <w:basedOn w:val="731"/>
     <w:uiPriority w:val="99"/>
     <w:pPr>
       <w:pBdr/>
@@ -19524,9 +19621,9 @@
       </w:tcPr>
     </w:tblStylePr>
   </w:style>
-  <w:style w:type="table" w:styleId="784" w:customStyle="1">
+  <w:style w:type="table" w:styleId="802" w:customStyle="1">
     <w:name w:val="List Table 2 - Accent 6"/>
-    <w:basedOn w:val="713"/>
+    <w:basedOn w:val="731"/>
     <w:uiPriority w:val="99"/>
     <w:pPr>
       <w:pBdr/>
@@ -19761,9 +19858,9 @@
       </w:tcPr>
     </w:tblStylePr>
   </w:style>
-  <w:style w:type="table" w:styleId="785">
+  <w:style w:type="table" w:styleId="803">
     <w:name w:val="List Table 3"/>
-    <w:basedOn w:val="713"/>
+    <w:basedOn w:val="731"/>
     <w:uiPriority w:val="99"/>
     <w:pPr>
       <w:pBdr/>
@@ -19988,9 +20085,9 @@
       </w:tcPr>
     </w:tblStylePr>
   </w:style>
-  <w:style w:type="table" w:styleId="786" w:customStyle="1">
+  <w:style w:type="table" w:styleId="804" w:customStyle="1">
     <w:name w:val="List Table 3 - Accent 1"/>
-    <w:basedOn w:val="713"/>
+    <w:basedOn w:val="731"/>
     <w:uiPriority w:val="99"/>
     <w:pPr>
       <w:pBdr/>
@@ -20215,9 +20312,9 @@
       </w:tcPr>
     </w:tblStylePr>
   </w:style>
-  <w:style w:type="table" w:styleId="787" w:customStyle="1">
+  <w:style w:type="table" w:styleId="805" w:customStyle="1">
     <w:name w:val="List Table 3 - Accent 2"/>
-    <w:basedOn w:val="713"/>
+    <w:basedOn w:val="731"/>
     <w:uiPriority w:val="99"/>
     <w:pPr>
       <w:pBdr/>
@@ -20442,9 +20539,9 @@
       </w:tcPr>
     </w:tblStylePr>
   </w:style>
-  <w:style w:type="table" w:styleId="788" w:customStyle="1">
+  <w:style w:type="table" w:styleId="806" w:customStyle="1">
     <w:name w:val="List Table 3 - Accent 3"/>
-    <w:basedOn w:val="713"/>
+    <w:basedOn w:val="731"/>
     <w:uiPriority w:val="99"/>
     <w:pPr>
       <w:pBdr/>
@@ -20669,9 +20766,9 @@
       </w:tcPr>
     </w:tblStylePr>
   </w:style>
-  <w:style w:type="table" w:styleId="789" w:customStyle="1">
+  <w:style w:type="table" w:styleId="807" w:customStyle="1">
     <w:name w:val="List Table 3 - Accent 4"/>
-    <w:basedOn w:val="713"/>
+    <w:basedOn w:val="731"/>
     <w:uiPriority w:val="99"/>
     <w:pPr>
       <w:pBdr/>
@@ -20896,9 +20993,9 @@
       </w:tcPr>
     </w:tblStylePr>
   </w:style>
-  <w:style w:type="table" w:styleId="790" w:customStyle="1">
+  <w:style w:type="table" w:styleId="808" w:customStyle="1">
     <w:name w:val="List Table 3 - Accent 5"/>
-    <w:basedOn w:val="713"/>
+    <w:basedOn w:val="731"/>
     <w:uiPriority w:val="99"/>
     <w:pPr>
       <w:pBdr/>
@@ -21123,9 +21220,9 @@
       </w:tcPr>
     </w:tblStylePr>
   </w:style>
-  <w:style w:type="table" w:styleId="791" w:customStyle="1">
+  <w:style w:type="table" w:styleId="809" w:customStyle="1">
     <w:name w:val="List Table 3 - Accent 6"/>
-    <w:basedOn w:val="713"/>
+    <w:basedOn w:val="731"/>
     <w:uiPriority w:val="99"/>
     <w:pPr>
       <w:pBdr/>
@@ -21350,9 +21447,9 @@
       </w:tcPr>
     </w:tblStylePr>
   </w:style>
-  <w:style w:type="table" w:styleId="792">
+  <w:style w:type="table" w:styleId="810">
     <w:name w:val="List Table 4"/>
-    <w:basedOn w:val="713"/>
+    <w:basedOn w:val="731"/>
     <w:uiPriority w:val="99"/>
     <w:pPr>
       <w:pBdr/>
@@ -21574,9 +21671,9 @@
       </w:tcPr>
     </w:tblStylePr>
   </w:style>
-  <w:style w:type="table" w:styleId="793" w:customStyle="1">
+  <w:style w:type="table" w:styleId="811" w:customStyle="1">
     <w:name w:val="List Table 4 - Accent 1"/>
-    <w:basedOn w:val="713"/>
+    <w:basedOn w:val="731"/>
     <w:uiPriority w:val="99"/>
     <w:pPr>
       <w:pBdr/>
@@ -21798,9 +21895,9 @@
       </w:tcPr>
     </w:tblStylePr>
   </w:style>
-  <w:style w:type="table" w:styleId="794" w:customStyle="1">
+  <w:style w:type="table" w:styleId="812" w:customStyle="1">
     <w:name w:val="List Table 4 - Accent 2"/>
-    <w:basedOn w:val="713"/>
+    <w:basedOn w:val="731"/>
     <w:uiPriority w:val="99"/>
     <w:pPr>
       <w:pBdr/>
@@ -22022,9 +22119,9 @@
       </w:tcPr>
     </w:tblStylePr>
   </w:style>
-  <w:style w:type="table" w:styleId="795" w:customStyle="1">
+  <w:style w:type="table" w:styleId="813" w:customStyle="1">
     <w:name w:val="List Table 4 - Accent 3"/>
-    <w:basedOn w:val="713"/>
+    <w:basedOn w:val="731"/>
     <w:uiPriority w:val="99"/>
     <w:pPr>
       <w:pBdr/>
@@ -22246,9 +22343,9 @@
       </w:tcPr>
     </w:tblStylePr>
   </w:style>
-  <w:style w:type="table" w:styleId="796" w:customStyle="1">
+  <w:style w:type="table" w:styleId="814" w:customStyle="1">
     <w:name w:val="List Table 4 - Accent 4"/>
-    <w:basedOn w:val="713"/>
+    <w:basedOn w:val="731"/>
     <w:uiPriority w:val="99"/>
     <w:pPr>
       <w:pBdr/>
@@ -22470,9 +22567,9 @@
       </w:tcPr>
     </w:tblStylePr>
   </w:style>
-  <w:style w:type="table" w:styleId="797" w:customStyle="1">
+  <w:style w:type="table" w:styleId="815" w:customStyle="1">
     <w:name w:val="List Table 4 - Accent 5"/>
-    <w:basedOn w:val="713"/>
+    <w:basedOn w:val="731"/>
     <w:uiPriority w:val="99"/>
     <w:pPr>
       <w:pBdr/>
@@ -22694,9 +22791,9 @@
       </w:tcPr>
     </w:tblStylePr>
   </w:style>
-  <w:style w:type="table" w:styleId="798" w:customStyle="1">
+  <w:style w:type="table" w:styleId="816" w:customStyle="1">
     <w:name w:val="List Table 4 - Accent 6"/>
-    <w:basedOn w:val="713"/>
+    <w:basedOn w:val="731"/>
     <w:uiPriority w:val="99"/>
     <w:pPr>
       <w:pBdr/>
@@ -22918,9 +23015,9 @@
       </w:tcPr>
     </w:tblStylePr>
   </w:style>
-  <w:style w:type="table" w:styleId="799">
+  <w:style w:type="table" w:styleId="817">
     <w:name w:val="List Table 5 Dark"/>
-    <w:basedOn w:val="713"/>
+    <w:basedOn w:val="731"/>
     <w:uiPriority w:val="99"/>
     <w:pPr>
       <w:pBdr/>
@@ -23154,9 +23251,9 @@
       </w:tcPr>
     </w:tblStylePr>
   </w:style>
-  <w:style w:type="table" w:styleId="800" w:customStyle="1">
+  <w:style w:type="table" w:styleId="818" w:customStyle="1">
     <w:name w:val="List Table 5 Dark - Accent 1"/>
-    <w:basedOn w:val="713"/>
+    <w:basedOn w:val="731"/>
     <w:uiPriority w:val="99"/>
     <w:pPr>
       <w:pBdr/>
@@ -23390,9 +23487,9 @@
       </w:tcPr>
     </w:tblStylePr>
   </w:style>
-  <w:style w:type="table" w:styleId="801" w:customStyle="1">
+  <w:style w:type="table" w:styleId="819" w:customStyle="1">
     <w:name w:val="List Table 5 Dark - Accent 2"/>
-    <w:basedOn w:val="713"/>
+    <w:basedOn w:val="731"/>
     <w:uiPriority w:val="99"/>
     <w:pPr>
       <w:pBdr/>
@@ -23626,9 +23723,9 @@
       </w:tcPr>
     </w:tblStylePr>
   </w:style>
-  <w:style w:type="table" w:styleId="802" w:customStyle="1">
+  <w:style w:type="table" w:styleId="820" w:customStyle="1">
     <w:name w:val="List Table 5 Dark - Accent 3"/>
-    <w:basedOn w:val="713"/>
+    <w:basedOn w:val="731"/>
     <w:uiPriority w:val="99"/>
     <w:pPr>
       <w:pBdr/>
@@ -23862,9 +23959,9 @@
       </w:tcPr>
     </w:tblStylePr>
   </w:style>
-  <w:style w:type="table" w:styleId="803" w:customStyle="1">
+  <w:style w:type="table" w:styleId="821" w:customStyle="1">
     <w:name w:val="List Table 5 Dark - Accent 4"/>
-    <w:basedOn w:val="713"/>
+    <w:basedOn w:val="731"/>
     <w:uiPriority w:val="99"/>
     <w:pPr>
       <w:pBdr/>
@@ -24098,9 +24195,9 @@
       </w:tcPr>
     </w:tblStylePr>
   </w:style>
-  <w:style w:type="table" w:styleId="804" w:customStyle="1">
+  <w:style w:type="table" w:styleId="822" w:customStyle="1">
     <w:name w:val="List Table 5 Dark - Accent 5"/>
-    <w:basedOn w:val="713"/>
+    <w:basedOn w:val="731"/>
     <w:uiPriority w:val="99"/>
     <w:pPr>
       <w:pBdr/>
@@ -24334,9 +24431,9 @@
       </w:tcPr>
     </w:tblStylePr>
   </w:style>
-  <w:style w:type="table" w:styleId="805" w:customStyle="1">
+  <w:style w:type="table" w:styleId="823" w:customStyle="1">
     <w:name w:val="List Table 5 Dark - Accent 6"/>
-    <w:basedOn w:val="713"/>
+    <w:basedOn w:val="731"/>
     <w:uiPriority w:val="99"/>
     <w:pPr>
       <w:pBdr/>
@@ -24570,9 +24667,9 @@
       </w:tcPr>
     </w:tblStylePr>
   </w:style>
-  <w:style w:type="table" w:styleId="806">
+  <w:style w:type="table" w:styleId="824">
     <w:name w:val="List Table 6 Colorful"/>
-    <w:basedOn w:val="713"/>
+    <w:basedOn w:val="731"/>
     <w:uiPriority w:val="99"/>
     <w:pPr>
       <w:pBdr/>
@@ -24792,9 +24889,9 @@
       </w:tcPr>
     </w:tblStylePr>
   </w:style>
-  <w:style w:type="table" w:styleId="807" w:customStyle="1">
+  <w:style w:type="table" w:styleId="825" w:customStyle="1">
     <w:name w:val="List Table 6 Colorful - Accent 1"/>
-    <w:basedOn w:val="713"/>
+    <w:basedOn w:val="731"/>
     <w:uiPriority w:val="99"/>
     <w:pPr>
       <w:pBdr/>
@@ -25014,9 +25111,9 @@
       </w:tcPr>
     </w:tblStylePr>
   </w:style>
-  <w:style w:type="table" w:styleId="808" w:customStyle="1">
+  <w:style w:type="table" w:styleId="826" w:customStyle="1">
     <w:name w:val="List Table 6 Colorful - Accent 2"/>
-    <w:basedOn w:val="713"/>
+    <w:basedOn w:val="731"/>
     <w:uiPriority w:val="99"/>
     <w:pPr>
       <w:pBdr/>
@@ -25236,9 +25333,9 @@
       </w:tcPr>
     </w:tblStylePr>
   </w:style>
-  <w:style w:type="table" w:styleId="809" w:customStyle="1">
+  <w:style w:type="table" w:styleId="827" w:customStyle="1">
     <w:name w:val="List Table 6 Colorful - Accent 3"/>
-    <w:basedOn w:val="713"/>
+    <w:basedOn w:val="731"/>
     <w:uiPriority w:val="99"/>
     <w:pPr>
       <w:pBdr/>
@@ -25458,9 +25555,9 @@
       </w:tcPr>
     </w:tblStylePr>
   </w:style>
-  <w:style w:type="table" w:styleId="810" w:customStyle="1">
+  <w:style w:type="table" w:styleId="828" w:customStyle="1">
     <w:name w:val="List Table 6 Colorful - Accent 4"/>
-    <w:basedOn w:val="713"/>
+    <w:basedOn w:val="731"/>
     <w:uiPriority w:val="99"/>
     <w:pPr>
       <w:pBdr/>
@@ -25680,9 +25777,9 @@
       </w:tcPr>
     </w:tblStylePr>
   </w:style>
-  <w:style w:type="table" w:styleId="811" w:customStyle="1">
+  <w:style w:type="table" w:styleId="829" w:customStyle="1">
     <w:name w:val="List Table 6 Colorful - Accent 5"/>
-    <w:basedOn w:val="713"/>
+    <w:basedOn w:val="731"/>
     <w:uiPriority w:val="99"/>
     <w:pPr>
       <w:pBdr/>
@@ -25902,9 +25999,9 @@
       </w:tcPr>
     </w:tblStylePr>
   </w:style>
-  <w:style w:type="table" w:styleId="812" w:customStyle="1">
+  <w:style w:type="table" w:styleId="830" w:customStyle="1">
     <w:name w:val="List Table 6 Colorful - Accent 6"/>
-    <w:basedOn w:val="713"/>
+    <w:basedOn w:val="731"/>
     <w:uiPriority w:val="99"/>
     <w:pPr>
       <w:pBdr/>
@@ -26124,9 +26221,9 @@
       </w:tcPr>
     </w:tblStylePr>
   </w:style>
-  <w:style w:type="table" w:styleId="813">
+  <w:style w:type="table" w:styleId="831">
     <w:name w:val="List Table 7 Colorful"/>
-    <w:basedOn w:val="713"/>
+    <w:basedOn w:val="731"/>
     <w:uiPriority w:val="99"/>
     <w:pPr>
       <w:pBdr/>
@@ -26374,9 +26471,9 @@
       </w:tcPr>
     </w:tblStylePr>
   </w:style>
-  <w:style w:type="table" w:styleId="814" w:customStyle="1">
+  <w:style w:type="table" w:styleId="832" w:customStyle="1">
     <w:name w:val="List Table 7 Colorful - Accent 1"/>
-    <w:basedOn w:val="713"/>
+    <w:basedOn w:val="731"/>
     <w:uiPriority w:val="99"/>
     <w:pPr>
       <w:pBdr/>
@@ -26624,9 +26721,9 @@
       </w:tcPr>
     </w:tblStylePr>
   </w:style>
-  <w:style w:type="table" w:styleId="815" w:customStyle="1">
+  <w:style w:type="table" w:styleId="833" w:customStyle="1">
     <w:name w:val="List Table 7 Colorful - Accent 2"/>
-    <w:basedOn w:val="713"/>
+    <w:basedOn w:val="731"/>
     <w:uiPriority w:val="99"/>
     <w:pPr>
       <w:pBdr/>
@@ -26874,9 +26971,9 @@
       </w:tcPr>
     </w:tblStylePr>
   </w:style>
-  <w:style w:type="table" w:styleId="816" w:customStyle="1">
+  <w:style w:type="table" w:styleId="834" w:customStyle="1">
     <w:name w:val="List Table 7 Colorful - Accent 3"/>
-    <w:basedOn w:val="713"/>
+    <w:basedOn w:val="731"/>
     <w:uiPriority w:val="99"/>
     <w:pPr>
       <w:pBdr/>
@@ -27124,9 +27221,9 @@
       </w:tcPr>
     </w:tblStylePr>
   </w:style>
-  <w:style w:type="table" w:styleId="817" w:customStyle="1">
+  <w:style w:type="table" w:styleId="835" w:customStyle="1">
     <w:name w:val="List Table 7 Colorful - Accent 4"/>
-    <w:basedOn w:val="713"/>
+    <w:basedOn w:val="731"/>
     <w:uiPriority w:val="99"/>
     <w:pPr>
       <w:pBdr/>
@@ -27374,9 +27471,9 @@
       </w:tcPr>
     </w:tblStylePr>
   </w:style>
-  <w:style w:type="table" w:styleId="818" w:customStyle="1">
+  <w:style w:type="table" w:styleId="836" w:customStyle="1">
     <w:name w:val="List Table 7 Colorful - Accent 5"/>
-    <w:basedOn w:val="713"/>
+    <w:basedOn w:val="731"/>
     <w:uiPriority w:val="99"/>
     <w:pPr>
       <w:pBdr/>
@@ -27624,9 +27721,9 @@
       </w:tcPr>
     </w:tblStylePr>
   </w:style>
-  <w:style w:type="table" w:styleId="819" w:customStyle="1">
+  <w:style w:type="table" w:styleId="837" w:customStyle="1">
     <w:name w:val="List Table 7 Colorful - Accent 6"/>
-    <w:basedOn w:val="713"/>
+    <w:basedOn w:val="731"/>
     <w:uiPriority w:val="99"/>
     <w:pPr>
       <w:pBdr/>
@@ -27874,9 +27971,9 @@
       </w:tcPr>
     </w:tblStylePr>
   </w:style>
-  <w:style w:type="table" w:styleId="820" w:customStyle="1">
+  <w:style w:type="table" w:styleId="838" w:customStyle="1">
     <w:name w:val="Lined - Accent"/>
-    <w:basedOn w:val="713"/>
+    <w:basedOn w:val="731"/>
     <w:uiPriority w:val="99"/>
     <w:pPr>
       <w:pBdr/>
@@ -28110,9 +28207,9 @@
       </w:tcPr>
     </w:tblStylePr>
   </w:style>
-  <w:style w:type="table" w:styleId="821" w:customStyle="1">
+  <w:style w:type="table" w:styleId="839" w:customStyle="1">
     <w:name w:val="Lined - Accent 1"/>
-    <w:basedOn w:val="713"/>
+    <w:basedOn w:val="731"/>
     <w:uiPriority w:val="99"/>
     <w:pPr>
       <w:pBdr/>
@@ -28346,9 +28443,9 @@
       </w:tcPr>
     </w:tblStylePr>
   </w:style>
-  <w:style w:type="table" w:styleId="822" w:customStyle="1">
+  <w:style w:type="table" w:styleId="840" w:customStyle="1">
     <w:name w:val="Lined - Accent 2"/>
-    <w:basedOn w:val="713"/>
+    <w:basedOn w:val="731"/>
     <w:uiPriority w:val="99"/>
     <w:pPr>
       <w:pBdr/>
@@ -28582,9 +28679,9 @@
       </w:tcPr>
     </w:tblStylePr>
   </w:style>
-  <w:style w:type="table" w:styleId="823" w:customStyle="1">
+  <w:style w:type="table" w:styleId="841" w:customStyle="1">
     <w:name w:val="Lined - Accent 3"/>
-    <w:basedOn w:val="713"/>
+    <w:basedOn w:val="731"/>
     <w:uiPriority w:val="99"/>
     <w:pPr>
       <w:pBdr/>
@@ -28818,9 +28915,9 @@
       </w:tcPr>
     </w:tblStylePr>
   </w:style>
-  <w:style w:type="table" w:styleId="824" w:customStyle="1">
+  <w:style w:type="table" w:styleId="842" w:customStyle="1">
     <w:name w:val="Lined - Accent 4"/>
-    <w:basedOn w:val="713"/>
+    <w:basedOn w:val="731"/>
     <w:uiPriority w:val="99"/>
     <w:pPr>
       <w:pBdr/>
@@ -29054,9 +29151,9 @@
       </w:tcPr>
     </w:tblStylePr>
   </w:style>
-  <w:style w:type="table" w:styleId="825" w:customStyle="1">
+  <w:style w:type="table" w:styleId="843" w:customStyle="1">
     <w:name w:val="Lined - Accent 5"/>
-    <w:basedOn w:val="713"/>
+    <w:basedOn w:val="731"/>
     <w:uiPriority w:val="99"/>
     <w:pPr>
       <w:pBdr/>
@@ -29290,9 +29387,9 @@
       </w:tcPr>
     </w:tblStylePr>
   </w:style>
-  <w:style w:type="table" w:styleId="826" w:customStyle="1">
+  <w:style w:type="table" w:styleId="844" w:customStyle="1">
     <w:name w:val="Lined - Accent 6"/>
-    <w:basedOn w:val="713"/>
+    <w:basedOn w:val="731"/>
     <w:uiPriority w:val="99"/>
     <w:pPr>
       <w:pBdr/>
@@ -29526,9 +29623,9 @@
       </w:tcPr>
     </w:tblStylePr>
   </w:style>
-  <w:style w:type="table" w:styleId="827" w:customStyle="1">
+  <w:style w:type="table" w:styleId="845" w:customStyle="1">
     <w:name w:val="Bordered &amp; Lined - Accent"/>
-    <w:basedOn w:val="713"/>
+    <w:basedOn w:val="731"/>
     <w:uiPriority w:val="99"/>
     <w:pPr>
       <w:pBdr/>
@@ -29769,9 +29866,9 @@
       </w:tcPr>
     </w:tblStylePr>
   </w:style>
-  <w:style w:type="table" w:styleId="828" w:customStyle="1">
+  <w:style w:type="table" w:styleId="846" w:customStyle="1">
     <w:name w:val="Bordered &amp; Lined - Accent 1"/>
-    <w:basedOn w:val="713"/>
+    <w:basedOn w:val="731"/>
     <w:uiPriority w:val="99"/>
     <w:pPr>
       <w:pBdr/>
@@ -30012,9 +30109,9 @@
       </w:tcPr>
     </w:tblStylePr>
   </w:style>
-  <w:style w:type="table" w:styleId="829" w:customStyle="1">
+  <w:style w:type="table" w:styleId="847" w:customStyle="1">
     <w:name w:val="Bordered &amp; Lined - Accent 2"/>
-    <w:basedOn w:val="713"/>
+    <w:basedOn w:val="731"/>
     <w:uiPriority w:val="99"/>
     <w:pPr>
       <w:pBdr/>
@@ -30255,9 +30352,9 @@
       </w:tcPr>
     </w:tblStylePr>
   </w:style>
-  <w:style w:type="table" w:styleId="830" w:customStyle="1">
+  <w:style w:type="table" w:styleId="848" w:customStyle="1">
     <w:name w:val="Bordered &amp; Lined - Accent 3"/>
-    <w:basedOn w:val="713"/>
+    <w:basedOn w:val="731"/>
     <w:uiPriority w:val="99"/>
     <w:pPr>
       <w:pBdr/>
@@ -30498,9 +30595,9 @@
       </w:tcPr>
     </w:tblStylePr>
   </w:style>
-  <w:style w:type="table" w:styleId="831" w:customStyle="1">
+  <w:style w:type="table" w:styleId="849" w:customStyle="1">
     <w:name w:val="Bordered &amp; Lined - Accent 4"/>
-    <w:basedOn w:val="713"/>
+    <w:basedOn w:val="731"/>
     <w:uiPriority w:val="99"/>
     <w:pPr>
       <w:pBdr/>
@@ -30741,9 +30838,9 @@
       </w:tcPr>
     </w:tblStylePr>
   </w:style>
-  <w:style w:type="table" w:styleId="832" w:customStyle="1">
+  <w:style w:type="table" w:styleId="850" w:customStyle="1">
     <w:name w:val="Bordered &amp; Lined - Accent 5"/>
-    <w:basedOn w:val="713"/>
+    <w:basedOn w:val="731"/>
     <w:uiPriority w:val="99"/>
     <w:pPr>
       <w:pBdr/>
@@ -30984,9 +31081,9 @@
       </w:tcPr>
     </w:tblStylePr>
   </w:style>
-  <w:style w:type="table" w:styleId="833" w:customStyle="1">
+  <w:style w:type="table" w:styleId="851" w:customStyle="1">
     <w:name w:val="Bordered &amp; Lined - Accent 6"/>
-    <w:basedOn w:val="713"/>
+    <w:basedOn w:val="731"/>
     <w:uiPriority w:val="99"/>
     <w:pPr>
       <w:pBdr/>
@@ -31227,9 +31324,9 @@
       </w:tcPr>
     </w:tblStylePr>
   </w:style>
-  <w:style w:type="table" w:styleId="834" w:customStyle="1">
+  <w:style w:type="table" w:styleId="852" w:customStyle="1">
     <w:name w:val="Bordered"/>
-    <w:basedOn w:val="713"/>
+    <w:basedOn w:val="731"/>
     <w:uiPriority w:val="99"/>
     <w:pPr>
       <w:pBdr/>
@@ -31457,9 +31554,9 @@
       </w:tcPr>
     </w:tblStylePr>
   </w:style>
-  <w:style w:type="table" w:styleId="835" w:customStyle="1">
+  <w:style w:type="table" w:styleId="853" w:customStyle="1">
     <w:name w:val="Bordered - Accent 1"/>
-    <w:basedOn w:val="713"/>
+    <w:basedOn w:val="731"/>
     <w:uiPriority w:val="99"/>
     <w:pPr>
       <w:pBdr/>
@@ -31687,9 +31784,9 @@
       </w:tcPr>
     </w:tblStylePr>
   </w:style>
-  <w:style w:type="table" w:styleId="836" w:customStyle="1">
+  <w:style w:type="table" w:styleId="854" w:customStyle="1">
     <w:name w:val="Bordered - Accent 2"/>
-    <w:basedOn w:val="713"/>
+    <w:basedOn w:val="731"/>
     <w:uiPriority w:val="99"/>
     <w:pPr>
       <w:pBdr/>
@@ -31917,9 +32014,9 @@
       </w:tcPr>
     </w:tblStylePr>
   </w:style>
-  <w:style w:type="table" w:styleId="837" w:customStyle="1">
+  <w:style w:type="table" w:styleId="855" w:customStyle="1">
     <w:name w:val="Bordered - Accent 3"/>
-    <w:basedOn w:val="713"/>
+    <w:basedOn w:val="731"/>
     <w:uiPriority w:val="99"/>
     <w:pPr>
       <w:pBdr/>
@@ -32147,9 +32244,9 @@
       </w:tcPr>
     </w:tblStylePr>
   </w:style>
-  <w:style w:type="table" w:styleId="838" w:customStyle="1">
+  <w:style w:type="table" w:styleId="856" w:customStyle="1">
     <w:name w:val="Bordered - Accent 4"/>
-    <w:basedOn w:val="713"/>
+    <w:basedOn w:val="731"/>
     <w:uiPriority w:val="99"/>
     <w:pPr>
       <w:pBdr/>
@@ -32377,9 +32474,9 @@
       </w:tcPr>
     </w:tblStylePr>
   </w:style>
-  <w:style w:type="table" w:styleId="839" w:customStyle="1">
+  <w:style w:type="table" w:styleId="857" w:customStyle="1">
     <w:name w:val="Bordered - Accent 5"/>
-    <w:basedOn w:val="713"/>
+    <w:basedOn w:val="731"/>
     <w:uiPriority w:val="99"/>
     <w:pPr>
       <w:pBdr/>
@@ -32607,9 +32704,9 @@
       </w:tcPr>
     </w:tblStylePr>
   </w:style>
-  <w:style w:type="table" w:styleId="840" w:customStyle="1">
+  <w:style w:type="table" w:styleId="858" w:customStyle="1">
     <w:name w:val="Bordered - Accent 6"/>
-    <w:basedOn w:val="713"/>
+    <w:basedOn w:val="731"/>
     <w:uiPriority w:val="99"/>
     <w:pPr>
       <w:pBdr/>
@@ -32837,10 +32934,10 @@
       </w:tcPr>
     </w:tblStylePr>
   </w:style>
-  <w:style w:type="character" w:styleId="841" w:customStyle="1">
+  <w:style w:type="character" w:styleId="859" w:customStyle="1">
     <w:name w:val="Título 1 Car"/>
-    <w:basedOn w:val="712"/>
-    <w:link w:val="703"/>
+    <w:basedOn w:val="730"/>
+    <w:link w:val="721"/>
     <w:uiPriority w:val="9"/>
     <w:pPr>
       <w:pBdr/>
@@ -32854,10 +32951,10 @@
       <w:szCs w:val="40"/>
     </w:rPr>
   </w:style>
-  <w:style w:type="character" w:styleId="842" w:customStyle="1">
+  <w:style w:type="character" w:styleId="860" w:customStyle="1">
     <w:name w:val="Título 2 Car"/>
-    <w:basedOn w:val="712"/>
-    <w:link w:val="704"/>
+    <w:basedOn w:val="730"/>
+    <w:link w:val="722"/>
     <w:uiPriority w:val="9"/>
     <w:pPr>
       <w:pBdr/>
@@ -32871,10 +32968,10 @@
       <w:szCs w:val="32"/>
     </w:rPr>
   </w:style>
-  <w:style w:type="character" w:styleId="843" w:customStyle="1">
+  <w:style w:type="character" w:styleId="861" w:customStyle="1">
     <w:name w:val="Título 3 Car"/>
-    <w:basedOn w:val="712"/>
-    <w:link w:val="705"/>
+    <w:basedOn w:val="730"/>
+    <w:link w:val="723"/>
     <w:uiPriority w:val="9"/>
     <w:pPr>
       <w:pBdr/>
@@ -32888,10 +32985,10 @@
       <w:szCs w:val="28"/>
     </w:rPr>
   </w:style>
-  <w:style w:type="character" w:styleId="844" w:customStyle="1">
+  <w:style w:type="character" w:styleId="862" w:customStyle="1">
     <w:name w:val="Título 4 Car"/>
-    <w:basedOn w:val="712"/>
-    <w:link w:val="706"/>
+    <w:basedOn w:val="730"/>
+    <w:link w:val="724"/>
     <w:uiPriority w:val="9"/>
     <w:pPr>
       <w:pBdr/>
@@ -32905,10 +33002,10 @@
       <w:color w:val="365f91" w:themeColor="accent1" w:themeShade="BF"/>
     </w:rPr>
   </w:style>
-  <w:style w:type="character" w:styleId="845" w:customStyle="1">
+  <w:style w:type="character" w:styleId="863" w:customStyle="1">
     <w:name w:val="Título 5 Car"/>
-    <w:basedOn w:val="712"/>
-    <w:link w:val="707"/>
+    <w:basedOn w:val="730"/>
+    <w:link w:val="725"/>
     <w:uiPriority w:val="9"/>
     <w:pPr>
       <w:pBdr/>
@@ -32920,10 +33017,10 @@
       <w:color w:val="365f91" w:themeColor="accent1" w:themeShade="BF"/>
     </w:rPr>
   </w:style>
-  <w:style w:type="character" w:styleId="846" w:customStyle="1">
+  <w:style w:type="character" w:styleId="864" w:customStyle="1">
     <w:name w:val="Título 6 Car"/>
-    <w:basedOn w:val="712"/>
-    <w:link w:val="708"/>
+    <w:basedOn w:val="730"/>
+    <w:link w:val="726"/>
     <w:uiPriority w:val="9"/>
     <w:pPr>
       <w:pBdr/>
@@ -32937,10 +33034,10 @@
       <w:color w:val="595959" w:themeColor="text1" w:themeTint="A6"/>
     </w:rPr>
   </w:style>
-  <w:style w:type="character" w:styleId="847" w:customStyle="1">
+  <w:style w:type="character" w:styleId="865" w:customStyle="1">
     <w:name w:val="Título 7 Car"/>
-    <w:basedOn w:val="712"/>
-    <w:link w:val="709"/>
+    <w:basedOn w:val="730"/>
+    <w:link w:val="727"/>
     <w:uiPriority w:val="9"/>
     <w:pPr>
       <w:pBdr/>
@@ -32952,10 +33049,10 @@
       <w:color w:val="595959" w:themeColor="text1" w:themeTint="A6"/>
     </w:rPr>
   </w:style>
-  <w:style w:type="character" w:styleId="848" w:customStyle="1">
+  <w:style w:type="character" w:styleId="866" w:customStyle="1">
     <w:name w:val="Título 8 Car"/>
-    <w:basedOn w:val="712"/>
-    <w:link w:val="710"/>
+    <w:basedOn w:val="730"/>
+    <w:link w:val="728"/>
     <w:uiPriority w:val="9"/>
     <w:pPr>
       <w:pBdr/>
@@ -32969,10 +33066,10 @@
       <w:color w:val="272727" w:themeColor="text1" w:themeTint="D8"/>
     </w:rPr>
   </w:style>
-  <w:style w:type="character" w:styleId="849" w:customStyle="1">
+  <w:style w:type="character" w:styleId="867" w:customStyle="1">
     <w:name w:val="Título 9 Car"/>
-    <w:basedOn w:val="712"/>
-    <w:link w:val="711"/>
+    <w:basedOn w:val="730"/>
+    <w:link w:val="729"/>
     <w:uiPriority w:val="9"/>
     <w:pPr>
       <w:pBdr/>
@@ -32986,11 +33083,11 @@
       <w:color w:val="272727" w:themeColor="text1" w:themeTint="D8"/>
     </w:rPr>
   </w:style>
-  <w:style w:type="paragraph" w:styleId="850">
+  <w:style w:type="paragraph" w:styleId="868">
     <w:name w:val="Title"/>
-    <w:basedOn w:val="702"/>
-    <w:next w:val="891"/>
-    <w:link w:val="851"/>
+    <w:basedOn w:val="720"/>
+    <w:next w:val="909"/>
+    <w:link w:val="869"/>
     <w:pPr>
       <w:keepNext w:val="true"/>
       <w:pBdr/>
@@ -33003,10 +33100,10 @@
       <w:szCs w:val="28"/>
     </w:rPr>
   </w:style>
-  <w:style w:type="character" w:styleId="851" w:customStyle="1">
+  <w:style w:type="character" w:styleId="869" w:customStyle="1">
     <w:name w:val="Título Car"/>
-    <w:basedOn w:val="712"/>
-    <w:link w:val="850"/>
+    <w:basedOn w:val="730"/>
+    <w:link w:val="868"/>
     <w:uiPriority w:val="10"/>
     <w:pPr>
       <w:pBdr/>
@@ -33020,11 +33117,11 @@
       <w:szCs w:val="56"/>
     </w:rPr>
   </w:style>
-  <w:style w:type="paragraph" w:styleId="852">
+  <w:style w:type="paragraph" w:styleId="870">
     <w:name w:val="Subtitle"/>
-    <w:basedOn w:val="702"/>
-    <w:next w:val="702"/>
-    <w:link w:val="853"/>
+    <w:basedOn w:val="720"/>
+    <w:next w:val="720"/>
+    <w:link w:val="871"/>
     <w:uiPriority w:val="11"/>
     <w:qFormat/>
     <w:pPr>
@@ -33042,10 +33139,10 @@
       <w:szCs w:val="28"/>
     </w:rPr>
   </w:style>
-  <w:style w:type="character" w:styleId="853" w:customStyle="1">
+  <w:style w:type="character" w:styleId="871" w:customStyle="1">
     <w:name w:val="Subtítulo Car"/>
-    <w:basedOn w:val="712"/>
-    <w:link w:val="852"/>
+    <w:basedOn w:val="730"/>
+    <w:link w:val="870"/>
     <w:uiPriority w:val="11"/>
     <w:pPr>
       <w:pBdr/>
@@ -33059,11 +33156,11 @@
       <w:szCs w:val="28"/>
     </w:rPr>
   </w:style>
-  <w:style w:type="paragraph" w:styleId="854">
+  <w:style w:type="paragraph" w:styleId="872">
     <w:name w:val="Quote"/>
-    <w:basedOn w:val="702"/>
-    <w:next w:val="702"/>
-    <w:link w:val="855"/>
+    <w:basedOn w:val="720"/>
+    <w:next w:val="720"/>
+    <w:link w:val="873"/>
     <w:uiPriority w:val="29"/>
     <w:qFormat/>
     <w:pPr>
@@ -33078,10 +33175,10 @@
       <w:color w:val="404040" w:themeColor="text1" w:themeTint="BF"/>
     </w:rPr>
   </w:style>
-  <w:style w:type="character" w:styleId="855" w:customStyle="1">
+  <w:style w:type="character" w:styleId="873" w:customStyle="1">
     <w:name w:val="Cita Car"/>
-    <w:basedOn w:val="712"/>
-    <w:link w:val="854"/>
+    <w:basedOn w:val="730"/>
+    <w:link w:val="872"/>
     <w:uiPriority w:val="29"/>
     <w:pPr>
       <w:pBdr/>
@@ -33094,9 +33191,9 @@
       <w:color w:val="404040" w:themeColor="text1" w:themeTint="BF"/>
     </w:rPr>
   </w:style>
-  <w:style w:type="paragraph" w:styleId="856">
+  <w:style w:type="paragraph" w:styleId="874">
     <w:name w:val="List Paragraph"/>
-    <w:basedOn w:val="702"/>
+    <w:basedOn w:val="720"/>
     <w:uiPriority w:val="34"/>
     <w:qFormat/>
     <w:pPr>
@@ -33106,9 +33203,9 @@
       <w:contextualSpacing w:val="true"/>
     </w:pPr>
   </w:style>
-  <w:style w:type="character" w:styleId="857">
+  <w:style w:type="character" w:styleId="875">
     <w:name w:val="Intense Emphasis"/>
-    <w:basedOn w:val="712"/>
+    <w:basedOn w:val="730"/>
     <w:uiPriority w:val="21"/>
     <w:qFormat/>
     <w:pPr>
@@ -33122,11 +33219,11 @@
       <w:color w:val="365f91" w:themeColor="accent1" w:themeShade="BF"/>
     </w:rPr>
   </w:style>
-  <w:style w:type="paragraph" w:styleId="858">
+  <w:style w:type="paragraph" w:styleId="876">
     <w:name w:val="Intense Quote"/>
-    <w:basedOn w:val="702"/>
-    <w:next w:val="702"/>
-    <w:link w:val="859"/>
+    <w:basedOn w:val="720"/>
+    <w:next w:val="720"/>
+    <w:link w:val="877"/>
     <w:uiPriority w:val="30"/>
     <w:qFormat/>
     <w:pPr>
@@ -33144,10 +33241,10 @@
       <w:color w:val="365f91" w:themeColor="accent1" w:themeShade="BF"/>
     </w:rPr>
   </w:style>
-  <w:style w:type="character" w:styleId="859" w:customStyle="1">
+  <w:style w:type="character" w:styleId="877" w:customStyle="1">
     <w:name w:val="Cita destacada Car"/>
-    <w:basedOn w:val="712"/>
-    <w:link w:val="858"/>
+    <w:basedOn w:val="730"/>
+    <w:link w:val="876"/>
     <w:uiPriority w:val="30"/>
     <w:pPr>
       <w:pBdr/>
@@ -33160,9 +33257,9 @@
       <w:color w:val="365f91" w:themeColor="accent1" w:themeShade="BF"/>
     </w:rPr>
   </w:style>
-  <w:style w:type="character" w:styleId="860">
+  <w:style w:type="character" w:styleId="878">
     <w:name w:val="Intense Reference"/>
-    <w:basedOn w:val="712"/>
+    <w:basedOn w:val="730"/>
     <w:uiPriority w:val="32"/>
     <w:qFormat/>
     <w:pPr>
@@ -33178,9 +33275,9 @@
       <w:spacing w:val="5"/>
     </w:rPr>
   </w:style>
-  <w:style w:type="paragraph" w:styleId="861">
+  <w:style w:type="paragraph" w:styleId="879">
     <w:name w:val="No Spacing"/>
-    <w:basedOn w:val="702"/>
+    <w:basedOn w:val="720"/>
     <w:uiPriority w:val="1"/>
     <w:qFormat/>
     <w:pPr>
@@ -33189,9 +33286,9 @@
       <w:ind/>
     </w:pPr>
   </w:style>
-  <w:style w:type="character" w:styleId="862">
+  <w:style w:type="character" w:styleId="880">
     <w:name w:val="Subtle Emphasis"/>
-    <w:basedOn w:val="712"/>
+    <w:basedOn w:val="730"/>
     <w:uiPriority w:val="19"/>
     <w:qFormat/>
     <w:pPr>
@@ -33205,9 +33302,9 @@
       <w:color w:val="404040" w:themeColor="text1" w:themeTint="BF"/>
     </w:rPr>
   </w:style>
-  <w:style w:type="character" w:styleId="863">
+  <w:style w:type="character" w:styleId="881">
     <w:name w:val="Emphasis"/>
-    <w:basedOn w:val="712"/>
+    <w:basedOn w:val="730"/>
     <w:uiPriority w:val="20"/>
     <w:qFormat/>
     <w:pPr>
@@ -33220,9 +33317,9 @@
       <w:iCs/>
     </w:rPr>
   </w:style>
-  <w:style w:type="character" w:styleId="864">
+  <w:style w:type="character" w:styleId="882">
     <w:name w:val="Strong"/>
-    <w:basedOn w:val="712"/>
+    <w:basedOn w:val="730"/>
     <w:uiPriority w:val="22"/>
     <w:qFormat/>
     <w:pPr>
@@ -33235,9 +33332,9 @@
       <w:bCs/>
     </w:rPr>
   </w:style>
-  <w:style w:type="character" w:styleId="865">
+  <w:style w:type="character" w:styleId="883">
     <w:name w:val="Subtle Reference"/>
-    <w:basedOn w:val="712"/>
+    <w:basedOn w:val="730"/>
     <w:uiPriority w:val="31"/>
     <w:qFormat/>
     <w:pPr>
@@ -33250,9 +33347,9 @@
       <w:color w:val="5a5a5a" w:themeColor="text1" w:themeTint="A5"/>
     </w:rPr>
   </w:style>
-  <w:style w:type="character" w:styleId="866">
+  <w:style w:type="character" w:styleId="884">
     <w:name w:val="Book Title"/>
-    <w:basedOn w:val="712"/>
+    <w:basedOn w:val="730"/>
     <w:uiPriority w:val="33"/>
     <w:qFormat/>
     <w:pPr>
@@ -33268,10 +33365,10 @@
       <w:spacing w:val="5"/>
     </w:rPr>
   </w:style>
-  <w:style w:type="character" w:styleId="867" w:customStyle="1">
+  <w:style w:type="character" w:styleId="885" w:customStyle="1">
     <w:name w:val="Encabezado Car"/>
-    <w:basedOn w:val="712"/>
-    <w:link w:val="903"/>
+    <w:basedOn w:val="730"/>
+    <w:link w:val="921"/>
     <w:uiPriority w:val="99"/>
     <w:pPr>
       <w:pBdr/>
@@ -33279,10 +33376,10 @@
       <w:ind/>
     </w:pPr>
   </w:style>
-  <w:style w:type="character" w:styleId="868" w:customStyle="1">
+  <w:style w:type="character" w:styleId="886" w:customStyle="1">
     <w:name w:val="Pie de página Car"/>
-    <w:basedOn w:val="712"/>
-    <w:link w:val="904"/>
+    <w:basedOn w:val="730"/>
+    <w:link w:val="922"/>
     <w:uiPriority w:val="99"/>
     <w:pPr>
       <w:pBdr/>
@@ -33290,10 +33387,10 @@
       <w:ind/>
     </w:pPr>
   </w:style>
-  <w:style w:type="paragraph" w:styleId="869">
+  <w:style w:type="paragraph" w:styleId="887">
     <w:name w:val="footnote text"/>
-    <w:basedOn w:val="702"/>
-    <w:link w:val="870"/>
+    <w:basedOn w:val="720"/>
+    <w:link w:val="888"/>
     <w:uiPriority w:val="99"/>
     <w:semiHidden/>
     <w:unhideWhenUsed/>
@@ -33303,10 +33400,10 @@
       <w:ind/>
     </w:pPr>
   </w:style>
-  <w:style w:type="character" w:styleId="870" w:customStyle="1">
+  <w:style w:type="character" w:styleId="888" w:customStyle="1">
     <w:name w:val="Texto nota pie Car"/>
-    <w:basedOn w:val="712"/>
-    <w:link w:val="869"/>
+    <w:basedOn w:val="730"/>
+    <w:link w:val="887"/>
     <w:uiPriority w:val="99"/>
     <w:semiHidden/>
     <w:pPr>
@@ -33319,9 +33416,9 @@
       <w:szCs w:val="20"/>
     </w:rPr>
   </w:style>
-  <w:style w:type="character" w:styleId="871">
+  <w:style w:type="character" w:styleId="889">
     <w:name w:val="footnote reference"/>
-    <w:basedOn w:val="712"/>
+    <w:basedOn w:val="730"/>
     <w:uiPriority w:val="99"/>
     <w:semiHidden/>
     <w:unhideWhenUsed/>
@@ -33334,10 +33431,10 @@
       <w:vertAlign w:val="superscript"/>
     </w:rPr>
   </w:style>
-  <w:style w:type="paragraph" w:styleId="872">
+  <w:style w:type="paragraph" w:styleId="890">
     <w:name w:val="endnote text"/>
-    <w:basedOn w:val="702"/>
-    <w:link w:val="873"/>
+    <w:basedOn w:val="720"/>
+    <w:link w:val="891"/>
     <w:uiPriority w:val="99"/>
     <w:semiHidden/>
     <w:unhideWhenUsed/>
@@ -33347,10 +33444,10 @@
       <w:ind/>
     </w:pPr>
   </w:style>
-  <w:style w:type="character" w:styleId="873" w:customStyle="1">
+  <w:style w:type="character" w:styleId="891" w:customStyle="1">
     <w:name w:val="Texto nota al final Car"/>
-    <w:basedOn w:val="712"/>
-    <w:link w:val="872"/>
+    <w:basedOn w:val="730"/>
+    <w:link w:val="890"/>
     <w:uiPriority w:val="99"/>
     <w:semiHidden/>
     <w:pPr>
@@ -33363,9 +33460,9 @@
       <w:szCs w:val="20"/>
     </w:rPr>
   </w:style>
-  <w:style w:type="character" w:styleId="874">
+  <w:style w:type="character" w:styleId="892">
     <w:name w:val="endnote reference"/>
-    <w:basedOn w:val="712"/>
+    <w:basedOn w:val="730"/>
     <w:uiPriority w:val="99"/>
     <w:semiHidden/>
     <w:unhideWhenUsed/>
@@ -33378,9 +33475,9 @@
       <w:vertAlign w:val="superscript"/>
     </w:rPr>
   </w:style>
-  <w:style w:type="character" w:styleId="875">
+  <w:style w:type="character" w:styleId="893">
     <w:name w:val="Hyperlink"/>
-    <w:basedOn w:val="712"/>
+    <w:basedOn w:val="730"/>
     <w:uiPriority w:val="99"/>
     <w:unhideWhenUsed/>
     <w:pPr>
@@ -33393,9 +33490,9 @@
       <w:u w:val="single"/>
     </w:rPr>
   </w:style>
-  <w:style w:type="character" w:styleId="876">
+  <w:style w:type="character" w:styleId="894">
     <w:name w:val="FollowedHyperlink"/>
-    <w:basedOn w:val="712"/>
+    <w:basedOn w:val="730"/>
     <w:uiPriority w:val="99"/>
     <w:semiHidden/>
     <w:unhideWhenUsed/>
@@ -33409,10 +33506,10 @@
       <w:u w:val="single"/>
     </w:rPr>
   </w:style>
-  <w:style w:type="paragraph" w:styleId="877">
+  <w:style w:type="paragraph" w:styleId="895">
     <w:name w:val="toc 1"/>
-    <w:basedOn w:val="702"/>
-    <w:next w:val="702"/>
+    <w:basedOn w:val="720"/>
+    <w:next w:val="720"/>
     <w:uiPriority w:val="39"/>
     <w:unhideWhenUsed/>
     <w:pPr>
@@ -33421,10 +33518,10 @@
       <w:ind/>
     </w:pPr>
   </w:style>
-  <w:style w:type="paragraph" w:styleId="878">
+  <w:style w:type="paragraph" w:styleId="896">
     <w:name w:val="toc 2"/>
-    <w:basedOn w:val="702"/>
-    <w:next w:val="702"/>
+    <w:basedOn w:val="720"/>
+    <w:next w:val="720"/>
     <w:uiPriority w:val="39"/>
     <w:unhideWhenUsed/>
     <w:pPr>
@@ -33433,10 +33530,10 @@
       <w:ind w:left="220"/>
     </w:pPr>
   </w:style>
-  <w:style w:type="paragraph" w:styleId="879">
+  <w:style w:type="paragraph" w:styleId="897">
     <w:name w:val="toc 3"/>
-    <w:basedOn w:val="702"/>
-    <w:next w:val="702"/>
+    <w:basedOn w:val="720"/>
+    <w:next w:val="720"/>
     <w:uiPriority w:val="39"/>
     <w:unhideWhenUsed/>
     <w:pPr>
@@ -33445,10 +33542,10 @@
       <w:ind w:left="440"/>
     </w:pPr>
   </w:style>
-  <w:style w:type="paragraph" w:styleId="880">
+  <w:style w:type="paragraph" w:styleId="898">
     <w:name w:val="toc 4"/>
-    <w:basedOn w:val="702"/>
-    <w:next w:val="702"/>
+    <w:basedOn w:val="720"/>
+    <w:next w:val="720"/>
     <w:uiPriority w:val="39"/>
     <w:unhideWhenUsed/>
     <w:pPr>
@@ -33457,10 +33554,10 @@
       <w:ind w:left="660"/>
     </w:pPr>
   </w:style>
-  <w:style w:type="paragraph" w:styleId="881">
+  <w:style w:type="paragraph" w:styleId="899">
     <w:name w:val="toc 5"/>
-    <w:basedOn w:val="702"/>
-    <w:next w:val="702"/>
+    <w:basedOn w:val="720"/>
+    <w:next w:val="720"/>
     <w:uiPriority w:val="39"/>
     <w:unhideWhenUsed/>
     <w:pPr>
@@ -33469,10 +33566,10 @@
       <w:ind w:left="880"/>
     </w:pPr>
   </w:style>
-  <w:style w:type="paragraph" w:styleId="882">
+  <w:style w:type="paragraph" w:styleId="900">
     <w:name w:val="toc 6"/>
-    <w:basedOn w:val="702"/>
-    <w:next w:val="702"/>
+    <w:basedOn w:val="720"/>
+    <w:next w:val="720"/>
     <w:uiPriority w:val="39"/>
     <w:unhideWhenUsed/>
     <w:pPr>
@@ -33481,10 +33578,10 @@
       <w:ind w:left="1100"/>
     </w:pPr>
   </w:style>
-  <w:style w:type="paragraph" w:styleId="883">
+  <w:style w:type="paragraph" w:styleId="901">
     <w:name w:val="toc 7"/>
-    <w:basedOn w:val="702"/>
-    <w:next w:val="702"/>
+    <w:basedOn w:val="720"/>
+    <w:next w:val="720"/>
     <w:uiPriority w:val="39"/>
     <w:unhideWhenUsed/>
     <w:pPr>
@@ -33493,10 +33590,10 @@
       <w:ind w:left="1320"/>
     </w:pPr>
   </w:style>
-  <w:style w:type="paragraph" w:styleId="884">
+  <w:style w:type="paragraph" w:styleId="902">
     <w:name w:val="toc 8"/>
-    <w:basedOn w:val="702"/>
-    <w:next w:val="702"/>
+    <w:basedOn w:val="720"/>
+    <w:next w:val="720"/>
     <w:uiPriority w:val="39"/>
     <w:unhideWhenUsed/>
     <w:pPr>
@@ -33505,10 +33602,10 @@
       <w:ind w:left="1540"/>
     </w:pPr>
   </w:style>
-  <w:style w:type="paragraph" w:styleId="885">
+  <w:style w:type="paragraph" w:styleId="903">
     <w:name w:val="toc 9"/>
-    <w:basedOn w:val="702"/>
-    <w:next w:val="702"/>
+    <w:basedOn w:val="720"/>
+    <w:next w:val="720"/>
     <w:uiPriority w:val="39"/>
     <w:unhideWhenUsed/>
     <w:pPr>
@@ -33517,9 +33614,9 @@
       <w:ind w:left="1760"/>
     </w:pPr>
   </w:style>
-  <w:style w:type="character" w:styleId="886">
+  <w:style w:type="character" w:styleId="904">
     <w:name w:val="Placeholder Text"/>
-    <w:basedOn w:val="712"/>
+    <w:basedOn w:val="730"/>
     <w:uiPriority w:val="99"/>
     <w:semiHidden/>
     <w:pPr>
@@ -33531,7 +33628,7 @@
       <w:color w:val="666666"/>
     </w:rPr>
   </w:style>
-  <w:style w:type="paragraph" w:styleId="887">
+  <w:style w:type="paragraph" w:styleId="905">
     <w:name w:val="TOC Heading"/>
     <w:uiPriority w:val="39"/>
     <w:unhideWhenUsed/>
@@ -33541,10 +33638,10 @@
       <w:ind/>
     </w:pPr>
   </w:style>
-  <w:style w:type="paragraph" w:styleId="888">
+  <w:style w:type="paragraph" w:styleId="906">
     <w:name w:val="table of figures"/>
-    <w:basedOn w:val="702"/>
-    <w:next w:val="702"/>
+    <w:basedOn w:val="720"/>
+    <w:next w:val="720"/>
     <w:uiPriority w:val="99"/>
     <w:unhideWhenUsed/>
     <w:pPr>
@@ -33553,7 +33650,7 @@
       <w:ind/>
     </w:pPr>
   </w:style>
-  <w:style w:type="character" w:styleId="889" w:customStyle="1">
+  <w:style w:type="character" w:styleId="907" w:customStyle="1">
     <w:name w:val="WW8Num1z0"/>
     <w:pPr>
       <w:pBdr/>
@@ -33561,7 +33658,7 @@
       <w:ind/>
     </w:pPr>
   </w:style>
-  <w:style w:type="character" w:styleId="890" w:customStyle="1">
+  <w:style w:type="character" w:styleId="908" w:customStyle="1">
     <w:name w:val="WW8Num2z0"/>
     <w:pPr>
       <w:pBdr/>
@@ -33569,9 +33666,9 @@
       <w:ind/>
     </w:pPr>
   </w:style>
-  <w:style w:type="paragraph" w:styleId="891">
+  <w:style w:type="paragraph" w:styleId="909">
     <w:name w:val="Body Text"/>
-    <w:basedOn w:val="702"/>
+    <w:basedOn w:val="720"/>
     <w:pPr>
       <w:pBdr/>
       <w:spacing/>
@@ -33582,9 +33679,9 @@
       <w:lang w:val="es-MX"/>
     </w:rPr>
   </w:style>
-  <w:style w:type="paragraph" w:styleId="892">
+  <w:style w:type="paragraph" w:styleId="910">
     <w:name w:val="List"/>
-    <w:basedOn w:val="891"/>
+    <w:basedOn w:val="909"/>
     <w:pPr>
       <w:pBdr/>
       <w:spacing/>
@@ -33594,9 +33691,9 @@
       <w:rFonts w:cs="Arial"/>
     </w:rPr>
   </w:style>
-  <w:style w:type="paragraph" w:styleId="893">
+  <w:style w:type="paragraph" w:styleId="911">
     <w:name w:val="Caption"/>
-    <w:basedOn w:val="702"/>
+    <w:basedOn w:val="720"/>
     <w:pPr>
       <w:suppressLineNumbers w:val="true"/>
       <w:pBdr/>
@@ -33611,9 +33708,9 @@
       <w:szCs w:val="24"/>
     </w:rPr>
   </w:style>
-  <w:style w:type="paragraph" w:styleId="894" w:customStyle="1">
+  <w:style w:type="paragraph" w:styleId="912" w:customStyle="1">
     <w:name w:val="Índice"/>
-    <w:basedOn w:val="702"/>
+    <w:basedOn w:val="720"/>
     <w:pPr>
       <w:suppressLineNumbers w:val="true"/>
       <w:pBdr/>
@@ -33624,9 +33721,9 @@
       <w:rFonts w:cs="Arial"/>
     </w:rPr>
   </w:style>
-  <w:style w:type="paragraph" w:styleId="895" w:customStyle="1">
+  <w:style w:type="paragraph" w:styleId="913" w:customStyle="1">
     <w:name w:val="Caption1"/>
-    <w:basedOn w:val="702"/>
+    <w:basedOn w:val="720"/>
     <w:pPr>
       <w:suppressLineNumbers w:val="true"/>
       <w:pBdr/>
@@ -33641,9 +33738,9 @@
       <w:szCs w:val="24"/>
     </w:rPr>
   </w:style>
-  <w:style w:type="paragraph" w:styleId="896" w:customStyle="1">
+  <w:style w:type="paragraph" w:styleId="914" w:customStyle="1">
     <w:name w:val="Caption11"/>
-    <w:basedOn w:val="702"/>
+    <w:basedOn w:val="720"/>
     <w:pPr>
       <w:suppressLineNumbers w:val="true"/>
       <w:pBdr/>
@@ -33658,9 +33755,9 @@
       <w:szCs w:val="24"/>
     </w:rPr>
   </w:style>
-  <w:style w:type="paragraph" w:styleId="897" w:customStyle="1">
+  <w:style w:type="paragraph" w:styleId="915" w:customStyle="1">
     <w:name w:val="Caption111"/>
-    <w:basedOn w:val="702"/>
+    <w:basedOn w:val="720"/>
     <w:pPr>
       <w:suppressLineNumbers w:val="true"/>
       <w:pBdr/>
@@ -33675,9 +33772,9 @@
       <w:szCs w:val="24"/>
     </w:rPr>
   </w:style>
-  <w:style w:type="paragraph" w:styleId="898" w:customStyle="1">
+  <w:style w:type="paragraph" w:styleId="916" w:customStyle="1">
     <w:name w:val="Caption1111"/>
-    <w:basedOn w:val="702"/>
+    <w:basedOn w:val="720"/>
     <w:pPr>
       <w:suppressLineNumbers w:val="true"/>
       <w:pBdr/>
@@ -33692,9 +33789,9 @@
       <w:szCs w:val="24"/>
     </w:rPr>
   </w:style>
-  <w:style w:type="paragraph" w:styleId="899" w:customStyle="1">
+  <w:style w:type="paragraph" w:styleId="917" w:customStyle="1">
     <w:name w:val="Caption11111"/>
-    <w:basedOn w:val="702"/>
+    <w:basedOn w:val="720"/>
     <w:pPr>
       <w:suppressLineNumbers w:val="true"/>
       <w:pBdr/>
@@ -33709,9 +33806,9 @@
       <w:szCs w:val="24"/>
     </w:rPr>
   </w:style>
-  <w:style w:type="paragraph" w:styleId="900" w:customStyle="1">
+  <w:style w:type="paragraph" w:styleId="918" w:customStyle="1">
     <w:name w:val="Caption111111"/>
-    <w:basedOn w:val="702"/>
+    <w:basedOn w:val="720"/>
     <w:pPr>
       <w:suppressLineNumbers w:val="true"/>
       <w:pBdr/>
@@ -33726,9 +33823,9 @@
       <w:szCs w:val="24"/>
     </w:rPr>
   </w:style>
-  <w:style w:type="paragraph" w:styleId="901">
+  <w:style w:type="paragraph" w:styleId="919">
     <w:name w:val="Body Text 2"/>
-    <w:basedOn w:val="702"/>
+    <w:basedOn w:val="720"/>
     <w:pPr>
       <w:pBdr/>
       <w:spacing/>
@@ -33741,9 +33838,9 @@
       <w:lang w:val="es-MX"/>
     </w:rPr>
   </w:style>
-  <w:style w:type="paragraph" w:styleId="902" w:customStyle="1">
+  <w:style w:type="paragraph" w:styleId="920" w:customStyle="1">
     <w:name w:val="Cabecera y pie"/>
-    <w:basedOn w:val="702"/>
+    <w:basedOn w:val="720"/>
     <w:pPr>
       <w:suppressLineNumbers w:val="true"/>
       <w:pBdr/>
@@ -33755,10 +33852,10 @@
       <w:ind/>
     </w:pPr>
   </w:style>
-  <w:style w:type="paragraph" w:styleId="903">
+  <w:style w:type="paragraph" w:styleId="921">
     <w:name w:val="Header"/>
-    <w:basedOn w:val="702"/>
-    <w:link w:val="867"/>
+    <w:basedOn w:val="720"/>
+    <w:link w:val="885"/>
     <w:pPr>
       <w:pBdr/>
       <w:tabs>
@@ -33769,10 +33866,10 @@
       <w:ind/>
     </w:pPr>
   </w:style>
-  <w:style w:type="paragraph" w:styleId="904">
+  <w:style w:type="paragraph" w:styleId="922">
     <w:name w:val="Footer"/>
-    <w:basedOn w:val="702"/>
-    <w:link w:val="868"/>
+    <w:basedOn w:val="720"/>
+    <w:link w:val="886"/>
     <w:pPr>
       <w:pBdr/>
       <w:tabs>
@@ -33783,9 +33880,9 @@
       <w:ind/>
     </w:pPr>
   </w:style>
-  <w:style w:type="paragraph" w:styleId="905">
+  <w:style w:type="paragraph" w:styleId="923">
     <w:name w:val="Body Text 3"/>
-    <w:basedOn w:val="702"/>
+    <w:basedOn w:val="720"/>
     <w:pPr>
       <w:pBdr/>
       <w:spacing/>

</xml_diff>